<commit_message>
Set the report's right tab stop after each Pages export
</commit_message>
<xml_diff>
--- a/survey_template_owner.docx
+++ b/survey_template_owner.docx
@@ -28684,6 +28684,9 @@
     <w:name w:val="Body A"/>
     <w:next w:val="Body A"/>
     <w:pPr>
+      <w:tabs>
+        <w:tab w:val="right" w:pos="6120"/>
+      </w:tabs>
       <w:keepNext w:val="0"/>
       <w:keepLines w:val="0"/>
       <w:pageBreakBefore w:val="0"/>
@@ -28923,6 +28926,9 @@
     <w:name w:val="Body B"/>
     <w:next w:val="Body B"/>
     <w:pPr>
+      <w:tabs>
+        <w:tab w:val="right" w:pos="6120"/>
+      </w:tabs>
       <w:keepNext w:val="0"/>
       <w:keepLines w:val="0"/>
       <w:pageBreakBefore w:val="0"/>
@@ -28971,6 +28977,9 @@
     <w:name w:val="Body C"/>
     <w:next w:val="Body C"/>
     <w:pPr>
+      <w:tabs>
+        <w:tab w:val="right" w:pos="6120"/>
+      </w:tabs>
       <w:keepNext w:val="0"/>
       <w:keepLines w:val="0"/>
       <w:pageBreakBefore w:val="0"/>

</xml_diff>

<commit_message>
Set the date tab stop per cell, not per style
The 27 tables do not share a column width. They run from 4.12" on Safety
Equipment to 4.44" on Deck and Hull, so one position set on Body A/B/C fitted
the wide tables and pushed the date across the table line on the narrow ones
-- exactly the tables Marc found wrong.

Each table now gets a stop measured from its own last column, less Word's
0.08" cell padding each side and another 0.08" so the date does not sit
against the border. 268 value cells across 20 tables.

The style-level stops the previous version wrote are taken back out. Two
stops fighting over one paragraph is undefined and Word picks one without
saying which.
</commit_message>
<xml_diff>
--- a/survey_template_owner.docx
+++ b/survey_template_owner.docx
@@ -808,6 +808,9 @@
           </w:tcPr>
           <w:p>
             <w:pPr>
+              <w:tabs>
+                <w:tab w:val="right" w:pos="5955"/>
+              </w:tabs>
               <w:pStyle w:val="Body A"/>
             </w:pPr>
             <w:r>
@@ -880,6 +883,9 @@
           </w:tcPr>
           <w:p>
             <w:pPr>
+              <w:tabs>
+                <w:tab w:val="right" w:pos="5955"/>
+              </w:tabs>
               <w:pStyle w:val="Body A"/>
             </w:pPr>
             <w:r>
@@ -952,6 +958,9 @@
           </w:tcPr>
           <w:p>
             <w:pPr>
+              <w:tabs>
+                <w:tab w:val="right" w:pos="5955"/>
+              </w:tabs>
               <w:pStyle w:val="Body A"/>
             </w:pPr>
             <w:r>
@@ -1024,6 +1033,9 @@
           </w:tcPr>
           <w:p>
             <w:pPr>
+              <w:tabs>
+                <w:tab w:val="right" w:pos="5955"/>
+              </w:tabs>
               <w:pStyle w:val="Body A"/>
             </w:pPr>
             <w:r>
@@ -1096,6 +1108,9 @@
           </w:tcPr>
           <w:p>
             <w:pPr>
+              <w:tabs>
+                <w:tab w:val="right" w:pos="5955"/>
+              </w:tabs>
               <w:pStyle w:val="Body A"/>
             </w:pPr>
             <w:r>
@@ -1168,6 +1183,9 @@
           </w:tcPr>
           <w:p>
             <w:pPr>
+              <w:tabs>
+                <w:tab w:val="right" w:pos="5955"/>
+              </w:tabs>
               <w:pStyle w:val="Body A"/>
             </w:pPr>
             <w:r>
@@ -1240,6 +1258,9 @@
           </w:tcPr>
           <w:p>
             <w:pPr>
+              <w:tabs>
+                <w:tab w:val="right" w:pos="5955"/>
+              </w:tabs>
               <w:pStyle w:val="Body A"/>
             </w:pPr>
             <w:r>
@@ -1312,6 +1333,9 @@
           </w:tcPr>
           <w:p>
             <w:pPr>
+              <w:tabs>
+                <w:tab w:val="right" w:pos="5955"/>
+              </w:tabs>
               <w:pStyle w:val="Body A"/>
             </w:pPr>
             <w:r>
@@ -2359,6 +2383,9 @@
           </w:tcPr>
           <w:p>
             <w:pPr>
+              <w:tabs>
+                <w:tab w:val="right" w:pos="5601"/>
+              </w:tabs>
               <w:pStyle w:val="Body A"/>
             </w:pPr>
             <w:r>
@@ -2433,6 +2460,9 @@
           </w:tcPr>
           <w:p>
             <w:pPr>
+              <w:tabs>
+                <w:tab w:val="right" w:pos="5601"/>
+              </w:tabs>
               <w:pStyle w:val="Body A"/>
             </w:pPr>
             <w:r>
@@ -2505,6 +2535,9 @@
           </w:tcPr>
           <w:p>
             <w:pPr>
+              <w:tabs>
+                <w:tab w:val="right" w:pos="5601"/>
+              </w:tabs>
               <w:pStyle w:val="Body A"/>
             </w:pPr>
             <w:r>
@@ -2577,6 +2610,9 @@
           </w:tcPr>
           <w:p>
             <w:pPr>
+              <w:tabs>
+                <w:tab w:val="right" w:pos="5601"/>
+              </w:tabs>
               <w:pStyle w:val="Body A"/>
             </w:pPr>
             <w:r>
@@ -2649,6 +2685,9 @@
           </w:tcPr>
           <w:p>
             <w:pPr>
+              <w:tabs>
+                <w:tab w:val="right" w:pos="5601"/>
+              </w:tabs>
               <w:pStyle w:val="Body A"/>
             </w:pPr>
             <w:r>
@@ -2722,6 +2761,9 @@
           </w:tcPr>
           <w:p>
             <w:pPr>
+              <w:tabs>
+                <w:tab w:val="right" w:pos="5601"/>
+              </w:tabs>
               <w:pStyle w:val="Body A"/>
             </w:pPr>
             <w:r>
@@ -2794,6 +2836,9 @@
           </w:tcPr>
           <w:p>
             <w:pPr>
+              <w:tabs>
+                <w:tab w:val="right" w:pos="5601"/>
+              </w:tabs>
               <w:pStyle w:val="Body A"/>
             </w:pPr>
             <w:r>
@@ -2866,6 +2911,9 @@
           </w:tcPr>
           <w:p>
             <w:pPr>
+              <w:tabs>
+                <w:tab w:val="right" w:pos="5601"/>
+              </w:tabs>
               <w:pStyle w:val="Body A"/>
             </w:pPr>
             <w:r>
@@ -2938,6 +2986,9 @@
           </w:tcPr>
           <w:p>
             <w:pPr>
+              <w:tabs>
+                <w:tab w:val="right" w:pos="5601"/>
+              </w:tabs>
               <w:pStyle w:val="Body A"/>
             </w:pPr>
             <w:r>
@@ -3010,6 +3061,9 @@
           </w:tcPr>
           <w:p>
             <w:pPr>
+              <w:tabs>
+                <w:tab w:val="right" w:pos="5601"/>
+              </w:tabs>
               <w:pStyle w:val="Body A"/>
             </w:pPr>
             <w:r>
@@ -3082,6 +3136,9 @@
           </w:tcPr>
           <w:p>
             <w:pPr>
+              <w:tabs>
+                <w:tab w:val="right" w:pos="5601"/>
+              </w:tabs>
               <w:pStyle w:val="Body A"/>
             </w:pPr>
             <w:r>
@@ -3154,6 +3211,9 @@
           </w:tcPr>
           <w:p>
             <w:pPr>
+              <w:tabs>
+                <w:tab w:val="right" w:pos="5601"/>
+              </w:tabs>
               <w:pStyle w:val="Body A"/>
             </w:pPr>
             <w:r>
@@ -3226,6 +3286,9 @@
           </w:tcPr>
           <w:p>
             <w:pPr>
+              <w:tabs>
+                <w:tab w:val="right" w:pos="5601"/>
+              </w:tabs>
               <w:pStyle w:val="Body A"/>
             </w:pPr>
             <w:r>
@@ -3298,6 +3361,9 @@
           </w:tcPr>
           <w:p>
             <w:pPr>
+              <w:tabs>
+                <w:tab w:val="right" w:pos="5601"/>
+              </w:tabs>
               <w:pStyle w:val="Body A"/>
             </w:pPr>
             <w:r>
@@ -3370,6 +3436,9 @@
           </w:tcPr>
           <w:p>
             <w:pPr>
+              <w:tabs>
+                <w:tab w:val="right" w:pos="5601"/>
+              </w:tabs>
               <w:pStyle w:val="Body A"/>
             </w:pPr>
             <w:r>
@@ -3442,6 +3511,9 @@
           </w:tcPr>
           <w:p>
             <w:pPr>
+              <w:tabs>
+                <w:tab w:val="right" w:pos="5601"/>
+              </w:tabs>
               <w:pStyle w:val="Body A"/>
             </w:pPr>
             <w:r>
@@ -3514,6 +3586,9 @@
           </w:tcPr>
           <w:p>
             <w:pPr>
+              <w:tabs>
+                <w:tab w:val="right" w:pos="5601"/>
+              </w:tabs>
               <w:pStyle w:val="Body A"/>
             </w:pPr>
             <w:r>
@@ -3898,6 +3973,9 @@
           </w:tcPr>
           <w:p>
             <w:pPr>
+              <w:tabs>
+                <w:tab w:val="right" w:pos="5823"/>
+              </w:tabs>
               <w:pStyle w:val="Body A"/>
             </w:pPr>
             <w:r>
@@ -3973,6 +4051,9 @@
           </w:tcPr>
           <w:p>
             <w:pPr>
+              <w:tabs>
+                <w:tab w:val="right" w:pos="5823"/>
+              </w:tabs>
               <w:pStyle w:val="Body A"/>
             </w:pPr>
             <w:r>
@@ -4048,6 +4129,9 @@
           </w:tcPr>
           <w:p>
             <w:pPr>
+              <w:tabs>
+                <w:tab w:val="right" w:pos="5823"/>
+              </w:tabs>
               <w:pStyle w:val="Body A"/>
             </w:pPr>
             <w:r>
@@ -4123,6 +4207,9 @@
           </w:tcPr>
           <w:p>
             <w:pPr>
+              <w:tabs>
+                <w:tab w:val="right" w:pos="5823"/>
+              </w:tabs>
               <w:pStyle w:val="Body A"/>
             </w:pPr>
             <w:r>
@@ -4198,6 +4285,9 @@
           </w:tcPr>
           <w:p>
             <w:pPr>
+              <w:tabs>
+                <w:tab w:val="right" w:pos="5823"/>
+              </w:tabs>
               <w:pStyle w:val="Body A"/>
             </w:pPr>
             <w:r>
@@ -4273,6 +4363,9 @@
           </w:tcPr>
           <w:p>
             <w:pPr>
+              <w:tabs>
+                <w:tab w:val="right" w:pos="5823"/>
+              </w:tabs>
               <w:pStyle w:val="Body A"/>
             </w:pPr>
             <w:r>
@@ -4348,6 +4441,9 @@
           </w:tcPr>
           <w:p>
             <w:pPr>
+              <w:tabs>
+                <w:tab w:val="right" w:pos="5823"/>
+              </w:tabs>
               <w:pStyle w:val="Body A"/>
             </w:pPr>
             <w:r>
@@ -4423,6 +4519,9 @@
           </w:tcPr>
           <w:p>
             <w:pPr>
+              <w:tabs>
+                <w:tab w:val="right" w:pos="5823"/>
+              </w:tabs>
               <w:pStyle w:val="Body A"/>
             </w:pPr>
             <w:r>
@@ -4498,6 +4597,9 @@
           </w:tcPr>
           <w:p>
             <w:pPr>
+              <w:tabs>
+                <w:tab w:val="right" w:pos="5823"/>
+              </w:tabs>
               <w:pStyle w:val="Body A"/>
             </w:pPr>
             <w:r>
@@ -4573,6 +4675,9 @@
           </w:tcPr>
           <w:p>
             <w:pPr>
+              <w:tabs>
+                <w:tab w:val="right" w:pos="5823"/>
+              </w:tabs>
               <w:pStyle w:val="Body A"/>
             </w:pPr>
             <w:r>
@@ -4648,6 +4753,9 @@
           </w:tcPr>
           <w:p>
             <w:pPr>
+              <w:tabs>
+                <w:tab w:val="right" w:pos="5823"/>
+              </w:tabs>
               <w:pStyle w:val="Body A"/>
             </w:pPr>
             <w:r>
@@ -4723,6 +4831,9 @@
           </w:tcPr>
           <w:p>
             <w:pPr>
+              <w:tabs>
+                <w:tab w:val="right" w:pos="5823"/>
+              </w:tabs>
               <w:pStyle w:val="Body A"/>
             </w:pPr>
             <w:r>
@@ -4798,6 +4909,9 @@
           </w:tcPr>
           <w:p>
             <w:pPr>
+              <w:tabs>
+                <w:tab w:val="right" w:pos="5823"/>
+              </w:tabs>
               <w:pStyle w:val="Body A"/>
             </w:pPr>
             <w:r>
@@ -4870,6 +4984,9 @@
           </w:tcPr>
           <w:p>
             <w:pPr>
+              <w:tabs>
+                <w:tab w:val="right" w:pos="5823"/>
+              </w:tabs>
               <w:pStyle w:val="Body A"/>
             </w:pPr>
             <w:r>
@@ -4945,6 +5062,9 @@
           </w:tcPr>
           <w:p>
             <w:pPr>
+              <w:tabs>
+                <w:tab w:val="right" w:pos="5823"/>
+              </w:tabs>
               <w:pStyle w:val="Body A"/>
             </w:pPr>
             <w:r>
@@ -5020,6 +5140,9 @@
           </w:tcPr>
           <w:p>
             <w:pPr>
+              <w:tabs>
+                <w:tab w:val="right" w:pos="5823"/>
+              </w:tabs>
               <w:pStyle w:val="Body A"/>
             </w:pPr>
             <w:r>
@@ -5095,6 +5218,9 @@
           </w:tcPr>
           <w:p>
             <w:pPr>
+              <w:tabs>
+                <w:tab w:val="right" w:pos="5823"/>
+              </w:tabs>
               <w:pStyle w:val="Body A"/>
             </w:pPr>
             <w:r>
@@ -5170,6 +5296,9 @@
           </w:tcPr>
           <w:p>
             <w:pPr>
+              <w:tabs>
+                <w:tab w:val="right" w:pos="5823"/>
+              </w:tabs>
               <w:pStyle w:val="Body A"/>
             </w:pPr>
             <w:r>
@@ -5242,6 +5371,9 @@
           </w:tcPr>
           <w:p>
             <w:pPr>
+              <w:tabs>
+                <w:tab w:val="right" w:pos="5823"/>
+              </w:tabs>
               <w:pStyle w:val="Body A"/>
             </w:pPr>
             <w:r>
@@ -5503,6 +5635,9 @@
           </w:tcPr>
           <w:p>
             <w:pPr>
+              <w:tabs>
+                <w:tab w:val="right" w:pos="5873"/>
+              </w:tabs>
               <w:pStyle w:val="Body A"/>
             </w:pPr>
             <w:r>
@@ -5579,6 +5714,9 @@
           </w:tcPr>
           <w:p>
             <w:pPr>
+              <w:tabs>
+                <w:tab w:val="right" w:pos="5873"/>
+              </w:tabs>
               <w:pStyle w:val="Body A"/>
             </w:pPr>
             <w:r>
@@ -5655,6 +5793,9 @@
           </w:tcPr>
           <w:p>
             <w:pPr>
+              <w:tabs>
+                <w:tab w:val="right" w:pos="5873"/>
+              </w:tabs>
               <w:pStyle w:val="Body B"/>
               <w:spacing w:before="36" w:after="36"/>
             </w:pPr>
@@ -5757,6 +5898,9 @@
           </w:tcPr>
           <w:p>
             <w:pPr>
+              <w:tabs>
+                <w:tab w:val="right" w:pos="5873"/>
+              </w:tabs>
               <w:pStyle w:val="Body B"/>
               <w:spacing w:before="36" w:after="36"/>
             </w:pPr>
@@ -5859,6 +6003,9 @@
           </w:tcPr>
           <w:p>
             <w:pPr>
+              <w:tabs>
+                <w:tab w:val="right" w:pos="5873"/>
+              </w:tabs>
               <w:pStyle w:val="Body B"/>
               <w:spacing w:before="36" w:after="36"/>
             </w:pPr>
@@ -5939,6 +6086,9 @@
           </w:tcPr>
           <w:p>
             <w:pPr>
+              <w:tabs>
+                <w:tab w:val="right" w:pos="5873"/>
+              </w:tabs>
               <w:pStyle w:val="Body B"/>
               <w:spacing w:before="36" w:after="36"/>
             </w:pPr>
@@ -6041,6 +6191,9 @@
           </w:tcPr>
           <w:p>
             <w:pPr>
+              <w:tabs>
+                <w:tab w:val="right" w:pos="5873"/>
+              </w:tabs>
               <w:pStyle w:val="Body B"/>
               <w:spacing w:before="36" w:after="36"/>
             </w:pPr>
@@ -6121,6 +6274,9 @@
           </w:tcPr>
           <w:p>
             <w:pPr>
+              <w:tabs>
+                <w:tab w:val="right" w:pos="5873"/>
+              </w:tabs>
               <w:pStyle w:val="Body B"/>
               <w:spacing w:before="36" w:after="36"/>
             </w:pPr>
@@ -6223,6 +6379,9 @@
           </w:tcPr>
           <w:p>
             <w:pPr>
+              <w:tabs>
+                <w:tab w:val="right" w:pos="5873"/>
+              </w:tabs>
               <w:pStyle w:val="Body B"/>
               <w:spacing w:before="36" w:after="36"/>
             </w:pPr>
@@ -6303,6 +6462,9 @@
           </w:tcPr>
           <w:p>
             <w:pPr>
+              <w:tabs>
+                <w:tab w:val="right" w:pos="5873"/>
+              </w:tabs>
               <w:pStyle w:val="Body B"/>
               <w:spacing w:before="36" w:after="36"/>
             </w:pPr>
@@ -6383,6 +6545,9 @@
           </w:tcPr>
           <w:p>
             <w:pPr>
+              <w:tabs>
+                <w:tab w:val="right" w:pos="5873"/>
+              </w:tabs>
               <w:pStyle w:val="Body B"/>
               <w:spacing w:before="36" w:after="36"/>
             </w:pPr>
@@ -6463,6 +6628,9 @@
           </w:tcPr>
           <w:p>
             <w:pPr>
+              <w:tabs>
+                <w:tab w:val="right" w:pos="5873"/>
+              </w:tabs>
               <w:pStyle w:val="Body B"/>
               <w:spacing w:before="36" w:after="36"/>
             </w:pPr>
@@ -6543,6 +6711,9 @@
           </w:tcPr>
           <w:p>
             <w:pPr>
+              <w:tabs>
+                <w:tab w:val="right" w:pos="5873"/>
+              </w:tabs>
               <w:pStyle w:val="Body B"/>
               <w:spacing w:before="36" w:after="36"/>
             </w:pPr>
@@ -6623,6 +6794,9 @@
           </w:tcPr>
           <w:p>
             <w:pPr>
+              <w:tabs>
+                <w:tab w:val="right" w:pos="5873"/>
+              </w:tabs>
               <w:pStyle w:val="Body B"/>
               <w:spacing w:before="36" w:after="36"/>
             </w:pPr>
@@ -6703,6 +6877,9 @@
           </w:tcPr>
           <w:p>
             <w:pPr>
+              <w:tabs>
+                <w:tab w:val="right" w:pos="5873"/>
+              </w:tabs>
               <w:pStyle w:val="Body B"/>
               <w:spacing w:before="36" w:after="36"/>
             </w:pPr>
@@ -6805,6 +6982,9 @@
           </w:tcPr>
           <w:p>
             <w:pPr>
+              <w:tabs>
+                <w:tab w:val="right" w:pos="5873"/>
+              </w:tabs>
               <w:pStyle w:val="Body B"/>
               <w:spacing w:before="36" w:after="36"/>
             </w:pPr>
@@ -6885,6 +7065,9 @@
           </w:tcPr>
           <w:p>
             <w:pPr>
+              <w:tabs>
+                <w:tab w:val="right" w:pos="5873"/>
+              </w:tabs>
               <w:pStyle w:val="Body B"/>
               <w:spacing w:before="36" w:after="36"/>
             </w:pPr>
@@ -6965,6 +7148,9 @@
           </w:tcPr>
           <w:p>
             <w:pPr>
+              <w:tabs>
+                <w:tab w:val="right" w:pos="5873"/>
+              </w:tabs>
               <w:pStyle w:val="Body B"/>
               <w:spacing w:before="36" w:after="36"/>
             </w:pPr>
@@ -7067,6 +7253,9 @@
           </w:tcPr>
           <w:p>
             <w:pPr>
+              <w:tabs>
+                <w:tab w:val="right" w:pos="5873"/>
+              </w:tabs>
               <w:pStyle w:val="Body B"/>
               <w:spacing w:before="36" w:after="36"/>
             </w:pPr>
@@ -7368,6 +7557,9 @@
           </w:tcPr>
           <w:p>
             <w:pPr>
+              <w:tabs>
+                <w:tab w:val="right" w:pos="5967"/>
+              </w:tabs>
               <w:pStyle w:val="Body B"/>
               <w:spacing w:before="36" w:after="36"/>
             </w:pPr>
@@ -7448,6 +7640,9 @@
           </w:tcPr>
           <w:p>
             <w:pPr>
+              <w:tabs>
+                <w:tab w:val="right" w:pos="5967"/>
+              </w:tabs>
               <w:pStyle w:val="Body B"/>
               <w:spacing w:before="36" w:after="36"/>
             </w:pPr>
@@ -7528,6 +7723,9 @@
           </w:tcPr>
           <w:p>
             <w:pPr>
+              <w:tabs>
+                <w:tab w:val="right" w:pos="5967"/>
+              </w:tabs>
               <w:pStyle w:val="Body B"/>
               <w:spacing w:before="36" w:after="36"/>
             </w:pPr>
@@ -7608,6 +7806,9 @@
           </w:tcPr>
           <w:p>
             <w:pPr>
+              <w:tabs>
+                <w:tab w:val="right" w:pos="5967"/>
+              </w:tabs>
               <w:pStyle w:val="Body B"/>
               <w:spacing w:before="36" w:after="36"/>
             </w:pPr>
@@ -7688,6 +7889,9 @@
           </w:tcPr>
           <w:p>
             <w:pPr>
+              <w:tabs>
+                <w:tab w:val="right" w:pos="5967"/>
+              </w:tabs>
               <w:pStyle w:val="Body B"/>
               <w:spacing w:before="36" w:after="36"/>
             </w:pPr>
@@ -7768,6 +7972,9 @@
           </w:tcPr>
           <w:p>
             <w:pPr>
+              <w:tabs>
+                <w:tab w:val="right" w:pos="5967"/>
+              </w:tabs>
               <w:pStyle w:val="Body B"/>
               <w:spacing w:before="36" w:after="36"/>
             </w:pPr>
@@ -7848,6 +8055,9 @@
           </w:tcPr>
           <w:p>
             <w:pPr>
+              <w:tabs>
+                <w:tab w:val="right" w:pos="5967"/>
+              </w:tabs>
               <w:pStyle w:val="Body B"/>
               <w:spacing w:before="36" w:after="36"/>
             </w:pPr>
@@ -7928,6 +8138,9 @@
           </w:tcPr>
           <w:p>
             <w:pPr>
+              <w:tabs>
+                <w:tab w:val="right" w:pos="5967"/>
+              </w:tabs>
               <w:pStyle w:val="Body B"/>
               <w:spacing w:before="36" w:after="36"/>
             </w:pPr>
@@ -8008,6 +8221,9 @@
           </w:tcPr>
           <w:p>
             <w:pPr>
+              <w:tabs>
+                <w:tab w:val="right" w:pos="5967"/>
+              </w:tabs>
               <w:pStyle w:val="Body B"/>
               <w:spacing w:before="36" w:after="36"/>
             </w:pPr>
@@ -8088,6 +8304,9 @@
           </w:tcPr>
           <w:p>
             <w:pPr>
+              <w:tabs>
+                <w:tab w:val="right" w:pos="5967"/>
+              </w:tabs>
               <w:pStyle w:val="Body B"/>
               <w:spacing w:before="36" w:after="36"/>
             </w:pPr>
@@ -8168,6 +8387,9 @@
           </w:tcPr>
           <w:p>
             <w:pPr>
+              <w:tabs>
+                <w:tab w:val="right" w:pos="5967"/>
+              </w:tabs>
               <w:pStyle w:val="Body B"/>
               <w:spacing w:before="36" w:after="36"/>
             </w:pPr>
@@ -8248,6 +8470,9 @@
           </w:tcPr>
           <w:p>
             <w:pPr>
+              <w:tabs>
+                <w:tab w:val="right" w:pos="5967"/>
+              </w:tabs>
               <w:pStyle w:val="Body B"/>
               <w:spacing w:before="36" w:after="36"/>
             </w:pPr>
@@ -8328,6 +8553,9 @@
           </w:tcPr>
           <w:p>
             <w:pPr>
+              <w:tabs>
+                <w:tab w:val="right" w:pos="5967"/>
+              </w:tabs>
               <w:pStyle w:val="Body B"/>
               <w:spacing w:before="36" w:after="36"/>
             </w:pPr>
@@ -8634,6 +8862,9 @@
           </w:tcPr>
           <w:p>
             <w:pPr>
+              <w:tabs>
+                <w:tab w:val="right" w:pos="6051"/>
+              </w:tabs>
               <w:pStyle w:val="Body C"/>
               <w:spacing w:before="36" w:after="36"/>
             </w:pPr>
@@ -8714,6 +8945,9 @@
           </w:tcPr>
           <w:p>
             <w:pPr>
+              <w:tabs>
+                <w:tab w:val="right" w:pos="6051"/>
+              </w:tabs>
               <w:pStyle w:val="Body C"/>
               <w:spacing w:before="36" w:after="36"/>
             </w:pPr>
@@ -8794,6 +9028,9 @@
           </w:tcPr>
           <w:p>
             <w:pPr>
+              <w:tabs>
+                <w:tab w:val="right" w:pos="6051"/>
+              </w:tabs>
               <w:pStyle w:val="Body C"/>
               <w:spacing w:before="36" w:after="36"/>
             </w:pPr>
@@ -8870,6 +9107,9 @@
           </w:tcPr>
           <w:p>
             <w:pPr>
+              <w:tabs>
+                <w:tab w:val="right" w:pos="6051"/>
+              </w:tabs>
               <w:pStyle w:val="Body C"/>
               <w:spacing w:before="36" w:after="36"/>
             </w:pPr>
@@ -8950,6 +9190,9 @@
           </w:tcPr>
           <w:p>
             <w:pPr>
+              <w:tabs>
+                <w:tab w:val="right" w:pos="6051"/>
+              </w:tabs>
               <w:pStyle w:val="Body C"/>
               <w:spacing w:before="36" w:after="36"/>
             </w:pPr>
@@ -9030,6 +9273,9 @@
           </w:tcPr>
           <w:p>
             <w:pPr>
+              <w:tabs>
+                <w:tab w:val="right" w:pos="6051"/>
+              </w:tabs>
               <w:pStyle w:val="Body C"/>
               <w:spacing w:before="36" w:after="36"/>
             </w:pPr>
@@ -9110,6 +9356,9 @@
           </w:tcPr>
           <w:p>
             <w:pPr>
+              <w:tabs>
+                <w:tab w:val="right" w:pos="6051"/>
+              </w:tabs>
               <w:pStyle w:val="Body C"/>
               <w:spacing w:before="36" w:after="36"/>
             </w:pPr>
@@ -9190,6 +9439,9 @@
           </w:tcPr>
           <w:p>
             <w:pPr>
+              <w:tabs>
+                <w:tab w:val="right" w:pos="6051"/>
+              </w:tabs>
               <w:pStyle w:val="Body C"/>
               <w:spacing w:before="36" w:after="36"/>
             </w:pPr>
@@ -9270,6 +9522,9 @@
           </w:tcPr>
           <w:p>
             <w:pPr>
+              <w:tabs>
+                <w:tab w:val="right" w:pos="6051"/>
+              </w:tabs>
               <w:pStyle w:val="Body C"/>
               <w:spacing w:before="36" w:after="36"/>
             </w:pPr>
@@ -9350,6 +9605,9 @@
           </w:tcPr>
           <w:p>
             <w:pPr>
+              <w:tabs>
+                <w:tab w:val="right" w:pos="6051"/>
+              </w:tabs>
               <w:pStyle w:val="Body C"/>
               <w:spacing w:before="36" w:after="36"/>
             </w:pPr>
@@ -9430,6 +9688,9 @@
           </w:tcPr>
           <w:p>
             <w:pPr>
+              <w:tabs>
+                <w:tab w:val="right" w:pos="6051"/>
+              </w:tabs>
               <w:pStyle w:val="Body C"/>
               <w:spacing w:before="36" w:after="36"/>
             </w:pPr>
@@ -9510,6 +9771,9 @@
           </w:tcPr>
           <w:p>
             <w:pPr>
+              <w:tabs>
+                <w:tab w:val="right" w:pos="6051"/>
+              </w:tabs>
               <w:pStyle w:val="Body C"/>
               <w:spacing w:before="36" w:after="36"/>
             </w:pPr>
@@ -9821,6 +10085,9 @@
           </w:tcPr>
           <w:p>
             <w:pPr>
+              <w:tabs>
+                <w:tab w:val="right" w:pos="5815"/>
+              </w:tabs>
               <w:pStyle w:val="Body C"/>
               <w:spacing w:before="36" w:after="36"/>
             </w:pPr>
@@ -9901,6 +10168,9 @@
           </w:tcPr>
           <w:p>
             <w:pPr>
+              <w:tabs>
+                <w:tab w:val="right" w:pos="5815"/>
+              </w:tabs>
               <w:pStyle w:val="Body C"/>
               <w:spacing w:before="36" w:after="36"/>
             </w:pPr>
@@ -9981,6 +10251,9 @@
           </w:tcPr>
           <w:p>
             <w:pPr>
+              <w:tabs>
+                <w:tab w:val="right" w:pos="5815"/>
+              </w:tabs>
               <w:pStyle w:val="Body C"/>
               <w:spacing w:before="36" w:after="36"/>
             </w:pPr>
@@ -10057,6 +10330,9 @@
           </w:tcPr>
           <w:p>
             <w:pPr>
+              <w:tabs>
+                <w:tab w:val="right" w:pos="5815"/>
+              </w:tabs>
               <w:pStyle w:val="Body C"/>
               <w:spacing w:before="36" w:after="36"/>
             </w:pPr>
@@ -10137,6 +10413,9 @@
           </w:tcPr>
           <w:p>
             <w:pPr>
+              <w:tabs>
+                <w:tab w:val="right" w:pos="5815"/>
+              </w:tabs>
               <w:pStyle w:val="Body C"/>
               <w:spacing w:before="36" w:after="36"/>
             </w:pPr>
@@ -10217,6 +10496,9 @@
           </w:tcPr>
           <w:p>
             <w:pPr>
+              <w:tabs>
+                <w:tab w:val="right" w:pos="5815"/>
+              </w:tabs>
               <w:pStyle w:val="Body C"/>
               <w:spacing w:before="36" w:after="36"/>
             </w:pPr>
@@ -10297,6 +10579,9 @@
           </w:tcPr>
           <w:p>
             <w:pPr>
+              <w:tabs>
+                <w:tab w:val="right" w:pos="5815"/>
+              </w:tabs>
               <w:pStyle w:val="Body C"/>
               <w:spacing w:before="36" w:after="36"/>
             </w:pPr>
@@ -10373,6 +10658,9 @@
           </w:tcPr>
           <w:p>
             <w:pPr>
+              <w:tabs>
+                <w:tab w:val="right" w:pos="5815"/>
+              </w:tabs>
               <w:pStyle w:val="Body A"/>
             </w:pPr>
             <w:r>
@@ -10449,6 +10737,9 @@
           </w:tcPr>
           <w:p>
             <w:pPr>
+              <w:tabs>
+                <w:tab w:val="right" w:pos="5815"/>
+              </w:tabs>
               <w:pStyle w:val="Body C"/>
               <w:spacing w:before="36" w:after="36"/>
             </w:pPr>
@@ -10529,6 +10820,9 @@
           </w:tcPr>
           <w:p>
             <w:pPr>
+              <w:tabs>
+                <w:tab w:val="right" w:pos="5815"/>
+              </w:tabs>
               <w:pStyle w:val="Body C"/>
               <w:spacing w:before="36" w:after="36"/>
             </w:pPr>
@@ -10609,6 +10903,9 @@
           </w:tcPr>
           <w:p>
             <w:pPr>
+              <w:tabs>
+                <w:tab w:val="right" w:pos="5815"/>
+              </w:tabs>
               <w:pStyle w:val="Default"/>
               <w:spacing w:before="36" w:after="36" w:line="240" w:lineRule="auto"/>
             </w:pPr>
@@ -10685,6 +10982,9 @@
           </w:tcPr>
           <w:p>
             <w:pPr>
+              <w:tabs>
+                <w:tab w:val="right" w:pos="5815"/>
+              </w:tabs>
               <w:pStyle w:val="Body C"/>
               <w:spacing w:before="36" w:after="36"/>
             </w:pPr>
@@ -10765,6 +11065,9 @@
           </w:tcPr>
           <w:p>
             <w:pPr>
+              <w:tabs>
+                <w:tab w:val="right" w:pos="5815"/>
+              </w:tabs>
               <w:pStyle w:val="Body C"/>
               <w:spacing w:before="36" w:after="36"/>
             </w:pPr>
@@ -10845,6 +11148,9 @@
           </w:tcPr>
           <w:p>
             <w:pPr>
+              <w:tabs>
+                <w:tab w:val="right" w:pos="5815"/>
+              </w:tabs>
               <w:pStyle w:val="Body C"/>
               <w:spacing w:before="36" w:after="36"/>
             </w:pPr>
@@ -10925,6 +11231,9 @@
           </w:tcPr>
           <w:p>
             <w:pPr>
+              <w:tabs>
+                <w:tab w:val="right" w:pos="5815"/>
+              </w:tabs>
               <w:pStyle w:val="Body C"/>
               <w:spacing w:before="36" w:after="36"/>
             </w:pPr>
@@ -11005,6 +11314,9 @@
           </w:tcPr>
           <w:p>
             <w:pPr>
+              <w:tabs>
+                <w:tab w:val="right" w:pos="5815"/>
+              </w:tabs>
               <w:pStyle w:val="Body C"/>
               <w:spacing w:before="36" w:after="36"/>
             </w:pPr>
@@ -11085,6 +11397,9 @@
           </w:tcPr>
           <w:p>
             <w:pPr>
+              <w:tabs>
+                <w:tab w:val="right" w:pos="5815"/>
+              </w:tabs>
               <w:pStyle w:val="Body C"/>
               <w:spacing w:before="36" w:after="36"/>
             </w:pPr>
@@ -11165,6 +11480,9 @@
           </w:tcPr>
           <w:p>
             <w:pPr>
+              <w:tabs>
+                <w:tab w:val="right" w:pos="5815"/>
+              </w:tabs>
               <w:pStyle w:val="Body C"/>
               <w:spacing w:before="36" w:after="36"/>
             </w:pPr>
@@ -11245,6 +11563,9 @@
           </w:tcPr>
           <w:p>
             <w:pPr>
+              <w:tabs>
+                <w:tab w:val="right" w:pos="5815"/>
+              </w:tabs>
               <w:pStyle w:val="Body C"/>
               <w:spacing w:before="36" w:after="36"/>
             </w:pPr>
@@ -11325,6 +11646,9 @@
           </w:tcPr>
           <w:p>
             <w:pPr>
+              <w:tabs>
+                <w:tab w:val="right" w:pos="5815"/>
+              </w:tabs>
               <w:pStyle w:val="Body C"/>
               <w:spacing w:before="36" w:after="36"/>
             </w:pPr>
@@ -11405,6 +11729,9 @@
           </w:tcPr>
           <w:p>
             <w:pPr>
+              <w:tabs>
+                <w:tab w:val="right" w:pos="5815"/>
+              </w:tabs>
               <w:pStyle w:val="Body C"/>
               <w:spacing w:before="36" w:after="36"/>
             </w:pPr>
@@ -11698,6 +12025,9 @@
           </w:tcPr>
           <w:p>
             <w:pPr>
+              <w:tabs>
+                <w:tab w:val="right" w:pos="5962"/>
+              </w:tabs>
               <w:pStyle w:val="Body C"/>
               <w:spacing w:before="36" w:after="36"/>
             </w:pPr>
@@ -11778,6 +12108,9 @@
           </w:tcPr>
           <w:p>
             <w:pPr>
+              <w:tabs>
+                <w:tab w:val="right" w:pos="5962"/>
+              </w:tabs>
               <w:pStyle w:val="Body C"/>
               <w:spacing w:before="36" w:after="36"/>
             </w:pPr>
@@ -11858,6 +12191,9 @@
           </w:tcPr>
           <w:p>
             <w:pPr>
+              <w:tabs>
+                <w:tab w:val="right" w:pos="5962"/>
+              </w:tabs>
               <w:pStyle w:val="Body C"/>
               <w:spacing w:before="36" w:after="36"/>
             </w:pPr>
@@ -11938,6 +12274,9 @@
           </w:tcPr>
           <w:p>
             <w:pPr>
+              <w:tabs>
+                <w:tab w:val="right" w:pos="5962"/>
+              </w:tabs>
               <w:pStyle w:val="Body C"/>
               <w:spacing w:before="36" w:after="36"/>
             </w:pPr>
@@ -12018,6 +12357,9 @@
           </w:tcPr>
           <w:p>
             <w:pPr>
+              <w:tabs>
+                <w:tab w:val="right" w:pos="5962"/>
+              </w:tabs>
               <w:pStyle w:val="Body C"/>
               <w:spacing w:before="36" w:after="36"/>
             </w:pPr>
@@ -12098,6 +12440,9 @@
           </w:tcPr>
           <w:p>
             <w:pPr>
+              <w:tabs>
+                <w:tab w:val="right" w:pos="5962"/>
+              </w:tabs>
               <w:pStyle w:val="Body C"/>
               <w:spacing w:before="36" w:after="36"/>
             </w:pPr>
@@ -12178,6 +12523,9 @@
           </w:tcPr>
           <w:p>
             <w:pPr>
+              <w:tabs>
+                <w:tab w:val="right" w:pos="5962"/>
+              </w:tabs>
               <w:pStyle w:val="Body C"/>
               <w:spacing w:before="36" w:after="36"/>
             </w:pPr>
@@ -12258,6 +12606,9 @@
           </w:tcPr>
           <w:p>
             <w:pPr>
+              <w:tabs>
+                <w:tab w:val="right" w:pos="5962"/>
+              </w:tabs>
               <w:pStyle w:val="Body C"/>
               <w:spacing w:before="36" w:after="36"/>
             </w:pPr>
@@ -12338,6 +12689,9 @@
           </w:tcPr>
           <w:p>
             <w:pPr>
+              <w:tabs>
+                <w:tab w:val="right" w:pos="5962"/>
+              </w:tabs>
               <w:pStyle w:val="Body C"/>
               <w:spacing w:before="36" w:after="36"/>
             </w:pPr>
@@ -12418,6 +12772,9 @@
           </w:tcPr>
           <w:p>
             <w:pPr>
+              <w:tabs>
+                <w:tab w:val="right" w:pos="5962"/>
+              </w:tabs>
               <w:pStyle w:val="Default"/>
               <w:spacing w:before="36" w:after="36" w:line="240" w:lineRule="auto"/>
             </w:pPr>
@@ -12498,6 +12855,9 @@
           </w:tcPr>
           <w:p>
             <w:pPr>
+              <w:tabs>
+                <w:tab w:val="right" w:pos="5962"/>
+              </w:tabs>
               <w:pStyle w:val="Default"/>
               <w:spacing w:before="36" w:after="36" w:line="240" w:lineRule="auto"/>
             </w:pPr>
@@ -12589,6 +12949,9 @@
           </w:tcPr>
           <w:p>
             <w:pPr>
+              <w:tabs>
+                <w:tab w:val="right" w:pos="5962"/>
+              </w:tabs>
               <w:pStyle w:val="Body C"/>
               <w:spacing w:before="36" w:after="36"/>
             </w:pPr>
@@ -12669,6 +13032,9 @@
           </w:tcPr>
           <w:p>
             <w:pPr>
+              <w:tabs>
+                <w:tab w:val="right" w:pos="5962"/>
+              </w:tabs>
               <w:pStyle w:val="Body C"/>
               <w:spacing w:before="36" w:after="36"/>
             </w:pPr>
@@ -12999,6 +13365,9 @@
           </w:tcPr>
           <w:p>
             <w:pPr>
+              <w:tabs>
+                <w:tab w:val="right" w:pos="5746"/>
+              </w:tabs>
               <w:pStyle w:val="Body A"/>
               <w:ind w:right="89"/>
             </w:pPr>
@@ -13073,6 +13442,9 @@
           </w:tcPr>
           <w:p>
             <w:pPr>
+              <w:tabs>
+                <w:tab w:val="right" w:pos="5746"/>
+              </w:tabs>
               <w:pStyle w:val="Body A"/>
               <w:ind w:right="89"/>
             </w:pPr>
@@ -13147,6 +13519,9 @@
           </w:tcPr>
           <w:p>
             <w:pPr>
+              <w:tabs>
+                <w:tab w:val="right" w:pos="5746"/>
+              </w:tabs>
               <w:pStyle w:val="Body A"/>
               <w:ind w:right="89"/>
             </w:pPr>
@@ -13221,6 +13596,9 @@
           </w:tcPr>
           <w:p>
             <w:pPr>
+              <w:tabs>
+                <w:tab w:val="right" w:pos="5746"/>
+              </w:tabs>
               <w:pStyle w:val="Body A"/>
               <w:ind w:right="89"/>
             </w:pPr>
@@ -13295,6 +13673,9 @@
           </w:tcPr>
           <w:p>
             <w:pPr>
+              <w:tabs>
+                <w:tab w:val="right" w:pos="5746"/>
+              </w:tabs>
               <w:pStyle w:val="Body A"/>
               <w:ind w:right="89"/>
             </w:pPr>
@@ -13434,6 +13815,9 @@
           </w:tcPr>
           <w:p>
             <w:pPr>
+              <w:tabs>
+                <w:tab w:val="right" w:pos="5746"/>
+              </w:tabs>
               <w:pStyle w:val="Body A"/>
               <w:ind w:right="89"/>
             </w:pPr>
@@ -13508,6 +13892,9 @@
           </w:tcPr>
           <w:p>
             <w:pPr>
+              <w:tabs>
+                <w:tab w:val="right" w:pos="5746"/>
+              </w:tabs>
               <w:pStyle w:val="Body A"/>
               <w:ind w:right="89"/>
             </w:pPr>
@@ -13582,6 +13969,9 @@
           </w:tcPr>
           <w:p>
             <w:pPr>
+              <w:tabs>
+                <w:tab w:val="right" w:pos="5746"/>
+              </w:tabs>
               <w:pStyle w:val="Body A"/>
               <w:ind w:right="89"/>
             </w:pPr>
@@ -13656,6 +14046,9 @@
           </w:tcPr>
           <w:p>
             <w:pPr>
+              <w:tabs>
+                <w:tab w:val="right" w:pos="5746"/>
+              </w:tabs>
               <w:pStyle w:val="Body A"/>
               <w:ind w:right="89"/>
             </w:pPr>
@@ -13730,6 +14123,9 @@
           </w:tcPr>
           <w:p>
             <w:pPr>
+              <w:tabs>
+                <w:tab w:val="right" w:pos="5746"/>
+              </w:tabs>
               <w:pStyle w:val="Body A"/>
               <w:ind w:right="89"/>
             </w:pPr>
@@ -13869,6 +14265,9 @@
           </w:tcPr>
           <w:p>
             <w:pPr>
+              <w:tabs>
+                <w:tab w:val="right" w:pos="5746"/>
+              </w:tabs>
               <w:pStyle w:val="Body A"/>
               <w:ind w:right="89"/>
             </w:pPr>
@@ -13943,6 +14342,9 @@
           </w:tcPr>
           <w:p>
             <w:pPr>
+              <w:tabs>
+                <w:tab w:val="right" w:pos="5746"/>
+              </w:tabs>
               <w:pStyle w:val="Body A"/>
               <w:ind w:right="89"/>
             </w:pPr>
@@ -14017,6 +14419,9 @@
           </w:tcPr>
           <w:p>
             <w:pPr>
+              <w:tabs>
+                <w:tab w:val="right" w:pos="5746"/>
+              </w:tabs>
               <w:pStyle w:val="Body A"/>
               <w:ind w:right="89"/>
             </w:pPr>
@@ -14091,6 +14496,9 @@
           </w:tcPr>
           <w:p>
             <w:pPr>
+              <w:tabs>
+                <w:tab w:val="right" w:pos="5746"/>
+              </w:tabs>
               <w:pStyle w:val="Body A"/>
               <w:ind w:right="89"/>
             </w:pPr>
@@ -14165,6 +14573,9 @@
           </w:tcPr>
           <w:p>
             <w:pPr>
+              <w:tabs>
+                <w:tab w:val="right" w:pos="5746"/>
+              </w:tabs>
               <w:pStyle w:val="Body A"/>
               <w:ind w:right="89"/>
             </w:pPr>
@@ -14243,6 +14654,9 @@
           </w:tcPr>
           <w:p>
             <w:pPr>
+              <w:tabs>
+                <w:tab w:val="right" w:pos="5746"/>
+              </w:tabs>
               <w:pStyle w:val="Default"/>
               <w:spacing w:before="36" w:after="36" w:line="240" w:lineRule="auto"/>
               <w:ind w:right="89"/>
@@ -14560,6 +14974,9 @@
           </w:tcPr>
           <w:p>
             <w:pPr>
+              <w:tabs>
+                <w:tab w:val="right" w:pos="5820"/>
+              </w:tabs>
               <w:pStyle w:val="Body C"/>
               <w:spacing w:before="36" w:after="36"/>
             </w:pPr>
@@ -14640,6 +15057,9 @@
           </w:tcPr>
           <w:p>
             <w:pPr>
+              <w:tabs>
+                <w:tab w:val="right" w:pos="5820"/>
+              </w:tabs>
               <w:pStyle w:val="Body C"/>
               <w:spacing w:before="36" w:after="36"/>
             </w:pPr>
@@ -14720,6 +15140,9 @@
           </w:tcPr>
           <w:p>
             <w:pPr>
+              <w:tabs>
+                <w:tab w:val="right" w:pos="5820"/>
+              </w:tabs>
               <w:pStyle w:val="Body C"/>
               <w:spacing w:before="36" w:after="36"/>
             </w:pPr>
@@ -14800,6 +15223,9 @@
           </w:tcPr>
           <w:p>
             <w:pPr>
+              <w:tabs>
+                <w:tab w:val="right" w:pos="5820"/>
+              </w:tabs>
               <w:pStyle w:val="Body C"/>
               <w:spacing w:before="36" w:after="36"/>
             </w:pPr>
@@ -14880,6 +15306,9 @@
           </w:tcPr>
           <w:p>
             <w:pPr>
+              <w:tabs>
+                <w:tab w:val="right" w:pos="5820"/>
+              </w:tabs>
               <w:pStyle w:val="Body C"/>
               <w:spacing w:before="36" w:after="36"/>
             </w:pPr>
@@ -14960,6 +15389,9 @@
           </w:tcPr>
           <w:p>
             <w:pPr>
+              <w:tabs>
+                <w:tab w:val="right" w:pos="5820"/>
+              </w:tabs>
               <w:pStyle w:val="Body C"/>
               <w:spacing w:before="36" w:after="36"/>
             </w:pPr>
@@ -15040,6 +15472,9 @@
           </w:tcPr>
           <w:p>
             <w:pPr>
+              <w:tabs>
+                <w:tab w:val="right" w:pos="5820"/>
+              </w:tabs>
               <w:pStyle w:val="Default"/>
               <w:spacing w:before="36" w:after="36" w:line="240" w:lineRule="auto"/>
             </w:pPr>
@@ -15354,6 +15789,9 @@
           </w:tcPr>
           <w:p>
             <w:pPr>
+              <w:tabs>
+                <w:tab w:val="right" w:pos="6035"/>
+              </w:tabs>
               <w:pStyle w:val="Body A"/>
             </w:pPr>
             <w:r>
@@ -15426,6 +15864,9 @@
           </w:tcPr>
           <w:p>
             <w:pPr>
+              <w:tabs>
+                <w:tab w:val="right" w:pos="6035"/>
+              </w:tabs>
               <w:pStyle w:val="Body A"/>
             </w:pPr>
             <w:r>
@@ -15498,6 +15939,9 @@
           </w:tcPr>
           <w:p>
             <w:pPr>
+              <w:tabs>
+                <w:tab w:val="right" w:pos="6035"/>
+              </w:tabs>
               <w:pStyle w:val="Body A"/>
             </w:pPr>
             <w:r>
@@ -15570,6 +16014,9 @@
           </w:tcPr>
           <w:p>
             <w:pPr>
+              <w:tabs>
+                <w:tab w:val="right" w:pos="6035"/>
+              </w:tabs>
               <w:pStyle w:val="Body A"/>
             </w:pPr>
             <w:r>
@@ -15642,6 +16089,9 @@
           </w:tcPr>
           <w:p>
             <w:pPr>
+              <w:tabs>
+                <w:tab w:val="right" w:pos="6035"/>
+              </w:tabs>
               <w:pStyle w:val="Body A"/>
             </w:pPr>
             <w:r>
@@ -15714,6 +16164,9 @@
           </w:tcPr>
           <w:p>
             <w:pPr>
+              <w:tabs>
+                <w:tab w:val="right" w:pos="6035"/>
+              </w:tabs>
               <w:pStyle w:val="Body A"/>
             </w:pPr>
             <w:r>
@@ -15786,6 +16239,9 @@
           </w:tcPr>
           <w:p>
             <w:pPr>
+              <w:tabs>
+                <w:tab w:val="right" w:pos="6035"/>
+              </w:tabs>
               <w:pStyle w:val="Body A"/>
             </w:pPr>
             <w:r>
@@ -15858,6 +16314,9 @@
           </w:tcPr>
           <w:p>
             <w:pPr>
+              <w:tabs>
+                <w:tab w:val="right" w:pos="6035"/>
+              </w:tabs>
               <w:pStyle w:val="Body A"/>
             </w:pPr>
             <w:r>
@@ -15930,6 +16389,9 @@
           </w:tcPr>
           <w:p>
             <w:pPr>
+              <w:tabs>
+                <w:tab w:val="right" w:pos="6035"/>
+              </w:tabs>
               <w:pStyle w:val="Body A"/>
             </w:pPr>
             <w:r>
@@ -16002,6 +16464,9 @@
           </w:tcPr>
           <w:p>
             <w:pPr>
+              <w:tabs>
+                <w:tab w:val="right" w:pos="6035"/>
+              </w:tabs>
               <w:pStyle w:val="Body A"/>
             </w:pPr>
             <w:r>
@@ -16074,6 +16539,9 @@
           </w:tcPr>
           <w:p>
             <w:pPr>
+              <w:tabs>
+                <w:tab w:val="right" w:pos="6035"/>
+              </w:tabs>
               <w:pStyle w:val="Body A"/>
             </w:pPr>
             <w:r>
@@ -16146,6 +16614,9 @@
           </w:tcPr>
           <w:p>
             <w:pPr>
+              <w:tabs>
+                <w:tab w:val="right" w:pos="6035"/>
+              </w:tabs>
               <w:pStyle w:val="Body A"/>
             </w:pPr>
             <w:r>
@@ -16218,6 +16689,9 @@
           </w:tcPr>
           <w:p>
             <w:pPr>
+              <w:tabs>
+                <w:tab w:val="right" w:pos="6035"/>
+              </w:tabs>
               <w:pStyle w:val="Body A"/>
             </w:pPr>
             <w:r>
@@ -16290,6 +16764,9 @@
           </w:tcPr>
           <w:p>
             <w:pPr>
+              <w:tabs>
+                <w:tab w:val="right" w:pos="6035"/>
+              </w:tabs>
               <w:pStyle w:val="Body A"/>
             </w:pPr>
             <w:r>
@@ -16362,6 +16839,9 @@
           </w:tcPr>
           <w:p>
             <w:pPr>
+              <w:tabs>
+                <w:tab w:val="right" w:pos="6035"/>
+              </w:tabs>
               <w:pStyle w:val="Body A"/>
             </w:pPr>
             <w:r>
@@ -16434,6 +16914,9 @@
           </w:tcPr>
           <w:p>
             <w:pPr>
+              <w:tabs>
+                <w:tab w:val="right" w:pos="6035"/>
+              </w:tabs>
               <w:pStyle w:val="Body A"/>
             </w:pPr>
             <w:r>
@@ -16506,6 +16989,9 @@
           </w:tcPr>
           <w:p>
             <w:pPr>
+              <w:tabs>
+                <w:tab w:val="right" w:pos="6035"/>
+              </w:tabs>
               <w:pStyle w:val="Body A"/>
             </w:pPr>
             <w:r>
@@ -16578,6 +17064,9 @@
           </w:tcPr>
           <w:p>
             <w:pPr>
+              <w:tabs>
+                <w:tab w:val="right" w:pos="6035"/>
+              </w:tabs>
               <w:pStyle w:val="Body A"/>
             </w:pPr>
             <w:r>
@@ -16650,6 +17139,9 @@
           </w:tcPr>
           <w:p>
             <w:pPr>
+              <w:tabs>
+                <w:tab w:val="right" w:pos="6035"/>
+              </w:tabs>
               <w:pStyle w:val="Body A"/>
             </w:pPr>
             <w:r>
@@ -16722,6 +17214,9 @@
           </w:tcPr>
           <w:p>
             <w:pPr>
+              <w:tabs>
+                <w:tab w:val="right" w:pos="6035"/>
+              </w:tabs>
               <w:pStyle w:val="Body A"/>
             </w:pPr>
             <w:r>
@@ -16794,6 +17289,9 @@
           </w:tcPr>
           <w:p>
             <w:pPr>
+              <w:tabs>
+                <w:tab w:val="right" w:pos="6035"/>
+              </w:tabs>
               <w:pStyle w:val="Body A"/>
             </w:pPr>
             <w:r>
@@ -17080,6 +17578,9 @@
           </w:tcPr>
           <w:p>
             <w:pPr>
+              <w:tabs>
+                <w:tab w:val="right" w:pos="5967"/>
+              </w:tabs>
               <w:pStyle w:val="Body A"/>
             </w:pPr>
             <w:r>
@@ -17152,6 +17653,9 @@
           </w:tcPr>
           <w:p>
             <w:pPr>
+              <w:tabs>
+                <w:tab w:val="right" w:pos="5967"/>
+              </w:tabs>
               <w:pStyle w:val="Body A"/>
             </w:pPr>
             <w:r>
@@ -17224,6 +17728,9 @@
           </w:tcPr>
           <w:p>
             <w:pPr>
+              <w:tabs>
+                <w:tab w:val="right" w:pos="5967"/>
+              </w:tabs>
               <w:pStyle w:val="Body A"/>
             </w:pPr>
             <w:r>
@@ -17296,6 +17803,9 @@
           </w:tcPr>
           <w:p>
             <w:pPr>
+              <w:tabs>
+                <w:tab w:val="right" w:pos="5967"/>
+              </w:tabs>
               <w:pStyle w:val="Body A"/>
             </w:pPr>
             <w:r>
@@ -17368,6 +17878,9 @@
           </w:tcPr>
           <w:p>
             <w:pPr>
+              <w:tabs>
+                <w:tab w:val="right" w:pos="5967"/>
+              </w:tabs>
               <w:pStyle w:val="Body A"/>
             </w:pPr>
             <w:r>
@@ -17566,6 +18079,9 @@
           </w:tcPr>
           <w:p>
             <w:pPr>
+              <w:tabs>
+                <w:tab w:val="right" w:pos="6045"/>
+              </w:tabs>
               <w:pStyle w:val="Body A"/>
             </w:pPr>
             <w:r>
@@ -17638,6 +18154,9 @@
           </w:tcPr>
           <w:p>
             <w:pPr>
+              <w:tabs>
+                <w:tab w:val="right" w:pos="6045"/>
+              </w:tabs>
               <w:pStyle w:val="Body A"/>
             </w:pPr>
             <w:r>
@@ -17710,6 +18229,9 @@
           </w:tcPr>
           <w:p>
             <w:pPr>
+              <w:tabs>
+                <w:tab w:val="right" w:pos="6045"/>
+              </w:tabs>
               <w:pStyle w:val="Body A"/>
             </w:pPr>
             <w:r>
@@ -17782,6 +18304,9 @@
           </w:tcPr>
           <w:p>
             <w:pPr>
+              <w:tabs>
+                <w:tab w:val="right" w:pos="6045"/>
+              </w:tabs>
               <w:pStyle w:val="Body A"/>
             </w:pPr>
             <w:r>
@@ -17854,6 +18379,9 @@
           </w:tcPr>
           <w:p>
             <w:pPr>
+              <w:tabs>
+                <w:tab w:val="right" w:pos="6045"/>
+              </w:tabs>
               <w:pStyle w:val="Body A"/>
             </w:pPr>
             <w:r>
@@ -17926,6 +18454,9 @@
           </w:tcPr>
           <w:p>
             <w:pPr>
+              <w:tabs>
+                <w:tab w:val="right" w:pos="6045"/>
+              </w:tabs>
               <w:pStyle w:val="Body A"/>
             </w:pPr>
             <w:r>
@@ -18006,6 +18537,9 @@
           </w:tcPr>
           <w:p>
             <w:pPr>
+              <w:tabs>
+                <w:tab w:val="right" w:pos="6045"/>
+              </w:tabs>
               <w:pStyle w:val="Body A"/>
             </w:pPr>
             <w:r>
@@ -18086,6 +18620,9 @@
           </w:tcPr>
           <w:p>
             <w:pPr>
+              <w:tabs>
+                <w:tab w:val="right" w:pos="6045"/>
+              </w:tabs>
               <w:pStyle w:val="Body A"/>
             </w:pPr>
             <w:r>
@@ -18166,6 +18703,9 @@
           </w:tcPr>
           <w:p>
             <w:pPr>
+              <w:tabs>
+                <w:tab w:val="right" w:pos="6045"/>
+              </w:tabs>
               <w:pStyle w:val="Body A"/>
             </w:pPr>
             <w:r>
@@ -18238,6 +18778,9 @@
           </w:tcPr>
           <w:p>
             <w:pPr>
+              <w:tabs>
+                <w:tab w:val="right" w:pos="6045"/>
+              </w:tabs>
               <w:pStyle w:val="Body A"/>
             </w:pPr>
             <w:r>
@@ -18518,6 +19061,9 @@
           </w:tcPr>
           <w:p>
             <w:pPr>
+              <w:tabs>
+                <w:tab w:val="right" w:pos="5655"/>
+              </w:tabs>
               <w:pStyle w:val="Body A"/>
             </w:pPr>
             <w:r>
@@ -18590,6 +19136,9 @@
           </w:tcPr>
           <w:p>
             <w:pPr>
+              <w:tabs>
+                <w:tab w:val="right" w:pos="5655"/>
+              </w:tabs>
               <w:pStyle w:val="Body A"/>
             </w:pPr>
             <w:r>
@@ -18662,6 +19211,9 @@
           </w:tcPr>
           <w:p>
             <w:pPr>
+              <w:tabs>
+                <w:tab w:val="right" w:pos="5655"/>
+              </w:tabs>
               <w:pStyle w:val="Body A"/>
             </w:pPr>
             <w:r>
@@ -18735,6 +19287,9 @@
           </w:tcPr>
           <w:p>
             <w:pPr>
+              <w:tabs>
+                <w:tab w:val="right" w:pos="5655"/>
+              </w:tabs>
               <w:pStyle w:val="Body A"/>
             </w:pPr>
             <w:r>
@@ -18807,6 +19362,9 @@
           </w:tcPr>
           <w:p>
             <w:pPr>
+              <w:tabs>
+                <w:tab w:val="right" w:pos="5655"/>
+              </w:tabs>
               <w:pStyle w:val="Body A"/>
             </w:pPr>
             <w:r>
@@ -18879,6 +19437,9 @@
           </w:tcPr>
           <w:p>
             <w:pPr>
+              <w:tabs>
+                <w:tab w:val="right" w:pos="5655"/>
+              </w:tabs>
               <w:pStyle w:val="Body A"/>
             </w:pPr>
             <w:r>
@@ -18951,6 +19512,9 @@
           </w:tcPr>
           <w:p>
             <w:pPr>
+              <w:tabs>
+                <w:tab w:val="right" w:pos="5655"/>
+              </w:tabs>
               <w:pStyle w:val="Body A"/>
             </w:pPr>
             <w:r>
@@ -19023,6 +19587,9 @@
           </w:tcPr>
           <w:p>
             <w:pPr>
+              <w:tabs>
+                <w:tab w:val="right" w:pos="5655"/>
+              </w:tabs>
               <w:pStyle w:val="Body A"/>
             </w:pPr>
             <w:r>
@@ -19095,6 +19662,9 @@
           </w:tcPr>
           <w:p>
             <w:pPr>
+              <w:tabs>
+                <w:tab w:val="right" w:pos="5655"/>
+              </w:tabs>
               <w:pStyle w:val="Body A"/>
             </w:pPr>
             <w:r>
@@ -19167,6 +19737,9 @@
           </w:tcPr>
           <w:p>
             <w:pPr>
+              <w:tabs>
+                <w:tab w:val="right" w:pos="5655"/>
+              </w:tabs>
               <w:pStyle w:val="Body A"/>
             </w:pPr>
             <w:r>
@@ -19300,6 +19873,9 @@
           </w:tcPr>
           <w:p>
             <w:pPr>
+              <w:tabs>
+                <w:tab w:val="right" w:pos="5655"/>
+              </w:tabs>
               <w:pStyle w:val="Body A"/>
             </w:pPr>
             <w:r>
@@ -19372,6 +19948,9 @@
           </w:tcPr>
           <w:p>
             <w:pPr>
+              <w:tabs>
+                <w:tab w:val="right" w:pos="5655"/>
+              </w:tabs>
               <w:pStyle w:val="Body A"/>
             </w:pPr>
             <w:r>
@@ -19444,6 +20023,9 @@
           </w:tcPr>
           <w:p>
             <w:pPr>
+              <w:tabs>
+                <w:tab w:val="right" w:pos="5655"/>
+              </w:tabs>
               <w:pStyle w:val="Body A"/>
             </w:pPr>
             <w:r>
@@ -19516,6 +20098,9 @@
           </w:tcPr>
           <w:p>
             <w:pPr>
+              <w:tabs>
+                <w:tab w:val="right" w:pos="5655"/>
+              </w:tabs>
               <w:pStyle w:val="Body A"/>
             </w:pPr>
             <w:r>
@@ -19588,6 +20173,9 @@
           </w:tcPr>
           <w:p>
             <w:pPr>
+              <w:tabs>
+                <w:tab w:val="right" w:pos="5655"/>
+              </w:tabs>
               <w:pStyle w:val="Body A"/>
             </w:pPr>
             <w:r>
@@ -19660,6 +20248,9 @@
           </w:tcPr>
           <w:p>
             <w:pPr>
+              <w:tabs>
+                <w:tab w:val="right" w:pos="5655"/>
+              </w:tabs>
               <w:pStyle w:val="Body A"/>
             </w:pPr>
             <w:r>
@@ -19793,6 +20384,9 @@
           </w:tcPr>
           <w:p>
             <w:pPr>
+              <w:tabs>
+                <w:tab w:val="right" w:pos="5655"/>
+              </w:tabs>
               <w:pStyle w:val="Body A"/>
             </w:pPr>
             <w:r>
@@ -19865,6 +20459,9 @@
           </w:tcPr>
           <w:p>
             <w:pPr>
+              <w:tabs>
+                <w:tab w:val="right" w:pos="5655"/>
+              </w:tabs>
               <w:pStyle w:val="Body A"/>
             </w:pPr>
             <w:r>
@@ -19937,6 +20534,9 @@
           </w:tcPr>
           <w:p>
             <w:pPr>
+              <w:tabs>
+                <w:tab w:val="right" w:pos="5655"/>
+              </w:tabs>
               <w:pStyle w:val="Body A"/>
             </w:pPr>
             <w:r>
@@ -20009,6 +20609,9 @@
           </w:tcPr>
           <w:p>
             <w:pPr>
+              <w:tabs>
+                <w:tab w:val="right" w:pos="5655"/>
+              </w:tabs>
               <w:pStyle w:val="Body A"/>
             </w:pPr>
             <w:r>
@@ -20081,6 +20684,9 @@
           </w:tcPr>
           <w:p>
             <w:pPr>
+              <w:tabs>
+                <w:tab w:val="right" w:pos="5655"/>
+              </w:tabs>
               <w:pStyle w:val="Body A"/>
             </w:pPr>
             <w:r>
@@ -20344,6 +20950,9 @@
           </w:tcPr>
           <w:p>
             <w:pPr>
+              <w:tabs>
+                <w:tab w:val="right" w:pos="5955"/>
+              </w:tabs>
               <w:pStyle w:val="Body A"/>
             </w:pPr>
             <w:r>
@@ -20416,6 +21025,9 @@
           </w:tcPr>
           <w:p>
             <w:pPr>
+              <w:tabs>
+                <w:tab w:val="right" w:pos="5955"/>
+              </w:tabs>
               <w:pStyle w:val="Body A"/>
             </w:pPr>
             <w:r>
@@ -20488,6 +21100,9 @@
           </w:tcPr>
           <w:p>
             <w:pPr>
+              <w:tabs>
+                <w:tab w:val="right" w:pos="5955"/>
+              </w:tabs>
               <w:pStyle w:val="Body A"/>
             </w:pPr>
             <w:r>
@@ -20560,6 +21175,9 @@
           </w:tcPr>
           <w:p>
             <w:pPr>
+              <w:tabs>
+                <w:tab w:val="right" w:pos="5955"/>
+              </w:tabs>
               <w:pStyle w:val="Body A"/>
             </w:pPr>
             <w:r>
@@ -20632,6 +21250,9 @@
           </w:tcPr>
           <w:p>
             <w:pPr>
+              <w:tabs>
+                <w:tab w:val="right" w:pos="5955"/>
+              </w:tabs>
               <w:pStyle w:val="Body A"/>
             </w:pPr>
             <w:r>
@@ -20704,6 +21325,9 @@
           </w:tcPr>
           <w:p>
             <w:pPr>
+              <w:tabs>
+                <w:tab w:val="right" w:pos="5955"/>
+              </w:tabs>
               <w:pStyle w:val="Body A"/>
             </w:pPr>
             <w:r>
@@ -20776,6 +21400,9 @@
           </w:tcPr>
           <w:p>
             <w:pPr>
+              <w:tabs>
+                <w:tab w:val="right" w:pos="5955"/>
+              </w:tabs>
               <w:pStyle w:val="Body A"/>
             </w:pPr>
             <w:r>
@@ -20852,6 +21479,9 @@
           </w:tcPr>
           <w:p>
             <w:pPr>
+              <w:tabs>
+                <w:tab w:val="right" w:pos="5955"/>
+              </w:tabs>
               <w:pStyle w:val="Default"/>
               <w:spacing w:before="36" w:after="36" w:line="240" w:lineRule="auto"/>
             </w:pPr>
@@ -21169,6 +21799,9 @@
           </w:tcPr>
           <w:p>
             <w:pPr>
+              <w:tabs>
+                <w:tab w:val="right" w:pos="5796"/>
+              </w:tabs>
               <w:pStyle w:val="Body C"/>
               <w:spacing w:before="36" w:after="36"/>
             </w:pPr>
@@ -21245,6 +21878,9 @@
           </w:tcPr>
           <w:p>
             <w:pPr>
+              <w:tabs>
+                <w:tab w:val="right" w:pos="5796"/>
+              </w:tabs>
               <w:pStyle w:val="Body C"/>
               <w:spacing w:before="36" w:after="36"/>
             </w:pPr>
@@ -21321,6 +21957,9 @@
           </w:tcPr>
           <w:p>
             <w:pPr>
+              <w:tabs>
+                <w:tab w:val="right" w:pos="5796"/>
+              </w:tabs>
               <w:pStyle w:val="Body C"/>
               <w:spacing w:before="36" w:after="36"/>
             </w:pPr>
@@ -21397,6 +22036,9 @@
           </w:tcPr>
           <w:p>
             <w:pPr>
+              <w:tabs>
+                <w:tab w:val="right" w:pos="5796"/>
+              </w:tabs>
               <w:pStyle w:val="Body C"/>
               <w:spacing w:before="36" w:after="36"/>
             </w:pPr>
@@ -21473,6 +22115,9 @@
           </w:tcPr>
           <w:p>
             <w:pPr>
+              <w:tabs>
+                <w:tab w:val="right" w:pos="5796"/>
+              </w:tabs>
               <w:pStyle w:val="Body C"/>
               <w:spacing w:before="36" w:after="36"/>
             </w:pPr>
@@ -21549,6 +22194,9 @@
           </w:tcPr>
           <w:p>
             <w:pPr>
+              <w:tabs>
+                <w:tab w:val="right" w:pos="5796"/>
+              </w:tabs>
               <w:pStyle w:val="Body C"/>
               <w:spacing w:before="36" w:after="36"/>
             </w:pPr>
@@ -21625,6 +22273,9 @@
           </w:tcPr>
           <w:p>
             <w:pPr>
+              <w:tabs>
+                <w:tab w:val="right" w:pos="5796"/>
+              </w:tabs>
               <w:pStyle w:val="Body C"/>
               <w:spacing w:before="36" w:after="36"/>
             </w:pPr>
@@ -21701,6 +22352,9 @@
           </w:tcPr>
           <w:p>
             <w:pPr>
+              <w:tabs>
+                <w:tab w:val="right" w:pos="5796"/>
+              </w:tabs>
               <w:pStyle w:val="Body C"/>
               <w:spacing w:before="36" w:after="36"/>
             </w:pPr>
@@ -21781,6 +22435,9 @@
           </w:tcPr>
           <w:p>
             <w:pPr>
+              <w:tabs>
+                <w:tab w:val="right" w:pos="5796"/>
+              </w:tabs>
               <w:pStyle w:val="Default"/>
               <w:spacing w:before="36" w:after="36" w:line="240" w:lineRule="auto"/>
             </w:pPr>
@@ -22116,6 +22773,9 @@
           </w:tcPr>
           <w:p>
             <w:pPr>
+              <w:tabs>
+                <w:tab w:val="right" w:pos="5600"/>
+              </w:tabs>
               <w:pStyle w:val="Body C"/>
               <w:spacing w:before="36" w:after="36"/>
             </w:pPr>
@@ -22192,6 +22852,9 @@
           </w:tcPr>
           <w:p>
             <w:pPr>
+              <w:tabs>
+                <w:tab w:val="right" w:pos="5600"/>
+              </w:tabs>
               <w:pStyle w:val="Body C"/>
               <w:spacing w:before="36" w:after="36"/>
             </w:pPr>
@@ -22268,6 +22931,9 @@
           </w:tcPr>
           <w:p>
             <w:pPr>
+              <w:tabs>
+                <w:tab w:val="right" w:pos="5600"/>
+              </w:tabs>
               <w:pStyle w:val="Body C"/>
               <w:spacing w:before="36" w:after="36"/>
             </w:pPr>
@@ -22344,6 +23010,9 @@
           </w:tcPr>
           <w:p>
             <w:pPr>
+              <w:tabs>
+                <w:tab w:val="right" w:pos="5600"/>
+              </w:tabs>
               <w:pStyle w:val="Body C"/>
               <w:spacing w:before="36" w:after="36"/>
             </w:pPr>
@@ -22420,6 +23089,9 @@
           </w:tcPr>
           <w:p>
             <w:pPr>
+              <w:tabs>
+                <w:tab w:val="right" w:pos="5600"/>
+              </w:tabs>
               <w:pStyle w:val="Body C"/>
               <w:spacing w:before="36" w:after="36"/>
             </w:pPr>
@@ -22496,6 +23168,9 @@
           </w:tcPr>
           <w:p>
             <w:pPr>
+              <w:tabs>
+                <w:tab w:val="right" w:pos="5600"/>
+              </w:tabs>
               <w:pStyle w:val="Body C"/>
               <w:spacing w:before="36" w:after="36"/>
             </w:pPr>
@@ -22572,6 +23247,9 @@
           </w:tcPr>
           <w:p>
             <w:pPr>
+              <w:tabs>
+                <w:tab w:val="right" w:pos="5600"/>
+              </w:tabs>
               <w:pStyle w:val="Body C"/>
               <w:spacing w:before="36" w:after="36"/>
             </w:pPr>
@@ -22648,6 +23326,9 @@
           </w:tcPr>
           <w:p>
             <w:pPr>
+              <w:tabs>
+                <w:tab w:val="right" w:pos="5600"/>
+              </w:tabs>
               <w:pStyle w:val="Default"/>
               <w:spacing w:before="36" w:after="36" w:line="240" w:lineRule="auto"/>
             </w:pPr>
@@ -22724,6 +23405,9 @@
           </w:tcPr>
           <w:p>
             <w:pPr>
+              <w:tabs>
+                <w:tab w:val="right" w:pos="5600"/>
+              </w:tabs>
               <w:pStyle w:val="Body C"/>
               <w:spacing w:before="36" w:after="36"/>
             </w:pPr>
@@ -22800,6 +23484,9 @@
           </w:tcPr>
           <w:p>
             <w:pPr>
+              <w:tabs>
+                <w:tab w:val="right" w:pos="5600"/>
+              </w:tabs>
               <w:pStyle w:val="Body C"/>
               <w:spacing w:before="36" w:after="36"/>
             </w:pPr>
@@ -22876,6 +23563,9 @@
           </w:tcPr>
           <w:p>
             <w:pPr>
+              <w:tabs>
+                <w:tab w:val="right" w:pos="5600"/>
+              </w:tabs>
               <w:pStyle w:val="Body C"/>
               <w:spacing w:before="36" w:after="36"/>
             </w:pPr>
@@ -22952,6 +23642,9 @@
           </w:tcPr>
           <w:p>
             <w:pPr>
+              <w:tabs>
+                <w:tab w:val="right" w:pos="5600"/>
+              </w:tabs>
               <w:pStyle w:val="Body C"/>
               <w:spacing w:before="36" w:after="36"/>
             </w:pPr>
@@ -23028,6 +23721,9 @@
           </w:tcPr>
           <w:p>
             <w:pPr>
+              <w:tabs>
+                <w:tab w:val="right" w:pos="5600"/>
+              </w:tabs>
               <w:pStyle w:val="Body C"/>
               <w:spacing w:before="36" w:after="36"/>
             </w:pPr>
@@ -23275,6 +23971,9 @@
           </w:tcPr>
           <w:p>
             <w:pPr>
+              <w:tabs>
+                <w:tab w:val="right" w:pos="5678"/>
+              </w:tabs>
               <w:pStyle w:val="Body C"/>
               <w:spacing w:before="36" w:after="36"/>
             </w:pPr>
@@ -23351,6 +24050,9 @@
           </w:tcPr>
           <w:p>
             <w:pPr>
+              <w:tabs>
+                <w:tab w:val="right" w:pos="5678"/>
+              </w:tabs>
               <w:pStyle w:val="Body A"/>
             </w:pPr>
             <w:r>
@@ -23423,6 +24125,9 @@
           </w:tcPr>
           <w:p>
             <w:pPr>
+              <w:tabs>
+                <w:tab w:val="right" w:pos="5678"/>
+              </w:tabs>
               <w:pStyle w:val="Body A"/>
             </w:pPr>
             <w:r>
@@ -23495,6 +24200,9 @@
           </w:tcPr>
           <w:p>
             <w:pPr>
+              <w:tabs>
+                <w:tab w:val="right" w:pos="5678"/>
+              </w:tabs>
               <w:pStyle w:val="Body A"/>
             </w:pPr>
             <w:r>
@@ -23567,6 +24275,9 @@
           </w:tcPr>
           <w:p>
             <w:pPr>
+              <w:tabs>
+                <w:tab w:val="right" w:pos="5678"/>
+              </w:tabs>
               <w:pStyle w:val="Body A"/>
             </w:pPr>
             <w:r>
@@ -23913,6 +24624,9 @@
           </w:tcPr>
           <w:p>
             <w:pPr>
+              <w:tabs>
+                <w:tab w:val="right" w:pos="5795"/>
+              </w:tabs>
               <w:pStyle w:val="Body A"/>
             </w:pPr>
             <w:r>
@@ -23985,6 +24699,9 @@
           </w:tcPr>
           <w:p>
             <w:pPr>
+              <w:tabs>
+                <w:tab w:val="right" w:pos="5795"/>
+              </w:tabs>
               <w:pStyle w:val="Body A"/>
             </w:pPr>
             <w:r>
@@ -24057,6 +24774,9 @@
           </w:tcPr>
           <w:p>
             <w:pPr>
+              <w:tabs>
+                <w:tab w:val="right" w:pos="5795"/>
+              </w:tabs>
               <w:pStyle w:val="Body A"/>
             </w:pPr>
             <w:r>
@@ -24129,6 +24849,9 @@
           </w:tcPr>
           <w:p>
             <w:pPr>
+              <w:tabs>
+                <w:tab w:val="right" w:pos="5795"/>
+              </w:tabs>
               <w:pStyle w:val="Body A"/>
             </w:pPr>
             <w:r>
@@ -24201,6 +24924,9 @@
           </w:tcPr>
           <w:p>
             <w:pPr>
+              <w:tabs>
+                <w:tab w:val="right" w:pos="5795"/>
+              </w:tabs>
               <w:pStyle w:val="Body A"/>
             </w:pPr>
             <w:r>
@@ -24273,6 +24999,9 @@
           </w:tcPr>
           <w:p>
             <w:pPr>
+              <w:tabs>
+                <w:tab w:val="right" w:pos="5795"/>
+              </w:tabs>
               <w:pStyle w:val="Body A"/>
             </w:pPr>
             <w:r>
@@ -24345,6 +25074,9 @@
           </w:tcPr>
           <w:p>
             <w:pPr>
+              <w:tabs>
+                <w:tab w:val="right" w:pos="5795"/>
+              </w:tabs>
               <w:pStyle w:val="Body A"/>
             </w:pPr>
             <w:r>
@@ -24417,6 +25149,9 @@
           </w:tcPr>
           <w:p>
             <w:pPr>
+              <w:tabs>
+                <w:tab w:val="right" w:pos="5795"/>
+              </w:tabs>
               <w:pStyle w:val="Body A"/>
             </w:pPr>
             <w:r>
@@ -24489,6 +25224,9 @@
           </w:tcPr>
           <w:p>
             <w:pPr>
+              <w:tabs>
+                <w:tab w:val="right" w:pos="5795"/>
+              </w:tabs>
               <w:pStyle w:val="Body A"/>
             </w:pPr>
             <w:r>
@@ -24561,6 +25299,9 @@
           </w:tcPr>
           <w:p>
             <w:pPr>
+              <w:tabs>
+                <w:tab w:val="right" w:pos="5795"/>
+              </w:tabs>
               <w:pStyle w:val="Body A"/>
             </w:pPr>
             <w:r>
@@ -24633,6 +25374,9 @@
           </w:tcPr>
           <w:p>
             <w:pPr>
+              <w:tabs>
+                <w:tab w:val="right" w:pos="5795"/>
+              </w:tabs>
               <w:pStyle w:val="Body A"/>
             </w:pPr>
             <w:r>
@@ -24705,6 +25449,9 @@
           </w:tcPr>
           <w:p>
             <w:pPr>
+              <w:tabs>
+                <w:tab w:val="right" w:pos="5795"/>
+              </w:tabs>
               <w:pStyle w:val="Body A"/>
             </w:pPr>
             <w:r>
@@ -24968,6 +25715,9 @@
           </w:tcPr>
           <w:p>
             <w:pPr>
+              <w:tabs>
+                <w:tab w:val="right" w:pos="5583"/>
+              </w:tabs>
               <w:pStyle w:val="Body A"/>
             </w:pPr>
             <w:r>
@@ -25040,6 +25790,9 @@
           </w:tcPr>
           <w:p>
             <w:pPr>
+              <w:tabs>
+                <w:tab w:val="right" w:pos="5583"/>
+              </w:tabs>
               <w:pStyle w:val="Body A"/>
             </w:pPr>
             <w:r>
@@ -25112,6 +25865,9 @@
           </w:tcPr>
           <w:p>
             <w:pPr>
+              <w:tabs>
+                <w:tab w:val="right" w:pos="5583"/>
+              </w:tabs>
               <w:pStyle w:val="Body A"/>
             </w:pPr>
             <w:r>
@@ -25184,6 +25940,9 @@
           </w:tcPr>
           <w:p>
             <w:pPr>
+              <w:tabs>
+                <w:tab w:val="right" w:pos="5583"/>
+              </w:tabs>
               <w:pStyle w:val="Body A"/>
             </w:pPr>
             <w:r>
@@ -25256,6 +26015,9 @@
           </w:tcPr>
           <w:p>
             <w:pPr>
+              <w:tabs>
+                <w:tab w:val="right" w:pos="5583"/>
+              </w:tabs>
               <w:pStyle w:val="Body A"/>
             </w:pPr>
             <w:r>
@@ -25328,6 +26090,9 @@
           </w:tcPr>
           <w:p>
             <w:pPr>
+              <w:tabs>
+                <w:tab w:val="right" w:pos="5583"/>
+              </w:tabs>
               <w:pStyle w:val="Body A"/>
             </w:pPr>
             <w:r>
@@ -25400,6 +26165,9 @@
           </w:tcPr>
           <w:p>
             <w:pPr>
+              <w:tabs>
+                <w:tab w:val="right" w:pos="5583"/>
+              </w:tabs>
               <w:pStyle w:val="Body A"/>
             </w:pPr>
             <w:r>
@@ -25472,6 +26240,9 @@
           </w:tcPr>
           <w:p>
             <w:pPr>
+              <w:tabs>
+                <w:tab w:val="right" w:pos="5583"/>
+              </w:tabs>
               <w:pStyle w:val="Body A"/>
             </w:pPr>
             <w:r>
@@ -25544,6 +26315,9 @@
           </w:tcPr>
           <w:p>
             <w:pPr>
+              <w:tabs>
+                <w:tab w:val="right" w:pos="5583"/>
+              </w:tabs>
               <w:pStyle w:val="Body A"/>
             </w:pPr>
             <w:r>
@@ -25616,6 +26390,9 @@
           </w:tcPr>
           <w:p>
             <w:pPr>
+              <w:tabs>
+                <w:tab w:val="right" w:pos="5583"/>
+              </w:tabs>
               <w:pStyle w:val="Body A"/>
             </w:pPr>
             <w:r>
@@ -25688,6 +26465,9 @@
           </w:tcPr>
           <w:p>
             <w:pPr>
+              <w:tabs>
+                <w:tab w:val="right" w:pos="5583"/>
+              </w:tabs>
               <w:pStyle w:val="Body A"/>
             </w:pPr>
             <w:r>
@@ -25760,6 +26540,9 @@
           </w:tcPr>
           <w:p>
             <w:pPr>
+              <w:tabs>
+                <w:tab w:val="right" w:pos="5583"/>
+              </w:tabs>
               <w:pStyle w:val="Body A"/>
             </w:pPr>
             <w:r>
@@ -25832,6 +26615,9 @@
           </w:tcPr>
           <w:p>
             <w:pPr>
+              <w:tabs>
+                <w:tab w:val="right" w:pos="5583"/>
+              </w:tabs>
               <w:pStyle w:val="Body A"/>
             </w:pPr>
             <w:r>
@@ -25904,6 +26690,9 @@
           </w:tcPr>
           <w:p>
             <w:pPr>
+              <w:tabs>
+                <w:tab w:val="right" w:pos="5583"/>
+              </w:tabs>
               <w:pStyle w:val="Body A"/>
             </w:pPr>
             <w:r>
@@ -25976,6 +26765,9 @@
           </w:tcPr>
           <w:p>
             <w:pPr>
+              <w:tabs>
+                <w:tab w:val="right" w:pos="5583"/>
+              </w:tabs>
               <w:pStyle w:val="Body A"/>
             </w:pPr>
             <w:r>
@@ -26048,6 +26840,9 @@
           </w:tcPr>
           <w:p>
             <w:pPr>
+              <w:tabs>
+                <w:tab w:val="right" w:pos="5583"/>
+              </w:tabs>
               <w:pStyle w:val="Body A"/>
             </w:pPr>
             <w:r>
@@ -26120,6 +26915,9 @@
           </w:tcPr>
           <w:p>
             <w:pPr>
+              <w:tabs>
+                <w:tab w:val="right" w:pos="5583"/>
+              </w:tabs>
               <w:pStyle w:val="Body A"/>
             </w:pPr>
             <w:r>
@@ -26192,6 +26990,9 @@
           </w:tcPr>
           <w:p>
             <w:pPr>
+              <w:tabs>
+                <w:tab w:val="right" w:pos="5583"/>
+              </w:tabs>
               <w:pStyle w:val="Body A"/>
             </w:pPr>
             <w:r>
@@ -26264,6 +27065,9 @@
           </w:tcPr>
           <w:p>
             <w:pPr>
+              <w:tabs>
+                <w:tab w:val="right" w:pos="5583"/>
+              </w:tabs>
               <w:pStyle w:val="Body A"/>
             </w:pPr>
             <w:r>
@@ -28684,9 +29488,6 @@
     <w:name w:val="Body A"/>
     <w:next w:val="Body A"/>
     <w:pPr>
-      <w:tabs>
-        <w:tab w:val="right" w:pos="6120"/>
-      </w:tabs>
       <w:keepNext w:val="0"/>
       <w:keepLines w:val="0"/>
       <w:pageBreakBefore w:val="0"/>
@@ -28926,9 +29727,6 @@
     <w:name w:val="Body B"/>
     <w:next w:val="Body B"/>
     <w:pPr>
-      <w:tabs>
-        <w:tab w:val="right" w:pos="6120"/>
-      </w:tabs>
       <w:keepNext w:val="0"/>
       <w:keepLines w:val="0"/>
       <w:pageBreakBefore w:val="0"/>
@@ -28977,9 +29775,6 @@
     <w:name w:val="Body C"/>
     <w:next w:val="Body C"/>
     <w:pPr>
-      <w:tabs>
-        <w:tab w:val="right" w:pos="6120"/>
-      </w:tabs>
       <w:keepNext w:val="0"/>
       <w:keepLines w:val="0"/>
       <w:pageBreakBefore w:val="0"/>

</xml_diff>

<commit_message>
Let a finding carry a photograph
The findings blocks looped over newline-separated strings, so a finding could
be a line of text and nothing else. They now loop over objects with a text and
a photo, and the server builds both shapes: the professional template still
reads the plain strings.

A photograph is matched to a line by number. b_finding_2_photo belongs to line
2 of b_findings. The app sorts the lines before numbering them and carries the
condition id through the sort, so the orders cannot drift.

scripts/add_finding_photos.py makes the template change and has to run after
every export from Pages, like add_date_column.py. The README now covers both,
along with where the template key list lives in the app.

The template in this commit also carries the date-column fix from the commit
before, since it is one binary file and cannot be split.
</commit_message>
<xml_diff>
--- a/survey_template_owner.docx
+++ b/survey_template_owner.docx
@@ -704,7 +704,7 @@
       <w:tblPr>
         <w:tblW w:w="9360" w:type="dxa"/>
         <w:jc w:val="left"/>
-        <w:tblInd w:w="1080" w:type="dxa"/>
+        <w:tblInd w:w="0" w:type="dxa"/>
         <w:tblBorders>
           <w:top w:val="single" w:color="ffffff" w:sz="8" w:space="0" w:shadow="0" w:frame="0"/>
           <w:left w:val="single" w:color="ffffff" w:sz="8" w:space="0" w:shadow="0" w:frame="0"/>
@@ -717,8 +717,8 @@
         <w:tblLayout w:type="fixed"/>
       </w:tblPr>
       <w:tblGrid>
-        <w:gridCol w:w="3060"/>
-        <w:gridCol w:w="6300"/>
+        <w:gridCol w:w="2740"/>
+        <w:gridCol w:w="6620"/>
       </w:tblGrid>
       <w:tr>
         <w:tblPrEx>
@@ -758,7 +758,7 @@
         </w:trPr>
         <w:tc>
           <w:tcPr>
-            <w:tcW w:type="dxa" w:w="3060"/>
+            <w:tcW w:type="dxa" w:w="2740"/>
             <w:tcBorders>
               <w:top w:val="single" w:color="666666" w:sz="6" w:space="0" w:shadow="0" w:frame="0"/>
               <w:left w:val="single" w:color="666666" w:sz="6" w:space="0" w:shadow="0" w:frame="0"/>
@@ -790,7 +790,7 @@
         </w:tc>
         <w:tc>
           <w:tcPr>
-            <w:tcW w:type="dxa" w:w="6300"/>
+            <w:tcW w:type="dxa" w:w="6620"/>
             <w:tcBorders>
               <w:top w:val="single" w:color="666666" w:sz="6" w:space="0" w:shadow="0" w:frame="0"/>
               <w:left w:val="single" w:color="666666" w:sz="6" w:space="0" w:shadow="0" w:frame="0"/>
@@ -830,7 +830,7 @@
         </w:trPr>
         <w:tc>
           <w:tcPr>
-            <w:tcW w:type="dxa" w:w="3060"/>
+            <w:tcW w:type="dxa" w:w="2740"/>
             <w:tcBorders>
               <w:top w:val="single" w:color="666666" w:sz="6" w:space="0" w:shadow="0" w:frame="0"/>
               <w:left w:val="single" w:color="666666" w:sz="6" w:space="0" w:shadow="0" w:frame="0"/>
@@ -862,7 +862,7 @@
         </w:tc>
         <w:tc>
           <w:tcPr>
-            <w:tcW w:type="dxa" w:w="6300"/>
+            <w:tcW w:type="dxa" w:w="6620"/>
             <w:tcBorders>
               <w:top w:val="single" w:color="666666" w:sz="6" w:space="0" w:shadow="0" w:frame="0"/>
               <w:left w:val="single" w:color="666666" w:sz="6" w:space="0" w:shadow="0" w:frame="0"/>
@@ -902,7 +902,7 @@
         </w:trPr>
         <w:tc>
           <w:tcPr>
-            <w:tcW w:type="dxa" w:w="3060"/>
+            <w:tcW w:type="dxa" w:w="2740"/>
             <w:tcBorders>
               <w:top w:val="single" w:color="666666" w:sz="6" w:space="0" w:shadow="0" w:frame="0"/>
               <w:left w:val="single" w:color="666666" w:sz="6" w:space="0" w:shadow="0" w:frame="0"/>
@@ -934,7 +934,7 @@
         </w:tc>
         <w:tc>
           <w:tcPr>
-            <w:tcW w:type="dxa" w:w="6300"/>
+            <w:tcW w:type="dxa" w:w="6620"/>
             <w:tcBorders>
               <w:top w:val="single" w:color="666666" w:sz="6" w:space="0" w:shadow="0" w:frame="0"/>
               <w:left w:val="single" w:color="666666" w:sz="6" w:space="0" w:shadow="0" w:frame="0"/>
@@ -974,7 +974,7 @@
         </w:trPr>
         <w:tc>
           <w:tcPr>
-            <w:tcW w:type="dxa" w:w="3060"/>
+            <w:tcW w:type="dxa" w:w="2740"/>
             <w:tcBorders>
               <w:top w:val="single" w:color="666666" w:sz="6" w:space="0" w:shadow="0" w:frame="0"/>
               <w:left w:val="single" w:color="666666" w:sz="6" w:space="0" w:shadow="0" w:frame="0"/>
@@ -1006,7 +1006,7 @@
         </w:tc>
         <w:tc>
           <w:tcPr>
-            <w:tcW w:type="dxa" w:w="6300"/>
+            <w:tcW w:type="dxa" w:w="6620"/>
             <w:tcBorders>
               <w:top w:val="single" w:color="666666" w:sz="6" w:space="0" w:shadow="0" w:frame="0"/>
               <w:left w:val="single" w:color="666666" w:sz="6" w:space="0" w:shadow="0" w:frame="0"/>
@@ -1046,7 +1046,7 @@
         </w:trPr>
         <w:tc>
           <w:tcPr>
-            <w:tcW w:type="dxa" w:w="3060"/>
+            <w:tcW w:type="dxa" w:w="2740"/>
             <w:tcBorders>
               <w:top w:val="single" w:color="666666" w:sz="6" w:space="0" w:shadow="0" w:frame="0"/>
               <w:left w:val="single" w:color="666666" w:sz="6" w:space="0" w:shadow="0" w:frame="0"/>
@@ -1078,7 +1078,7 @@
         </w:tc>
         <w:tc>
           <w:tcPr>
-            <w:tcW w:type="dxa" w:w="6300"/>
+            <w:tcW w:type="dxa" w:w="6620"/>
             <w:tcBorders>
               <w:top w:val="single" w:color="666666" w:sz="6" w:space="0" w:shadow="0" w:frame="0"/>
               <w:left w:val="single" w:color="666666" w:sz="6" w:space="0" w:shadow="0" w:frame="0"/>
@@ -1118,7 +1118,7 @@
         </w:trPr>
         <w:tc>
           <w:tcPr>
-            <w:tcW w:type="dxa" w:w="3060"/>
+            <w:tcW w:type="dxa" w:w="2740"/>
             <w:tcBorders>
               <w:top w:val="single" w:color="666666" w:sz="6" w:space="0" w:shadow="0" w:frame="0"/>
               <w:left w:val="single" w:color="666666" w:sz="6" w:space="0" w:shadow="0" w:frame="0"/>
@@ -1150,7 +1150,7 @@
         </w:tc>
         <w:tc>
           <w:tcPr>
-            <w:tcW w:type="dxa" w:w="6300"/>
+            <w:tcW w:type="dxa" w:w="6620"/>
             <w:tcBorders>
               <w:top w:val="single" w:color="666666" w:sz="6" w:space="0" w:shadow="0" w:frame="0"/>
               <w:left w:val="single" w:color="666666" w:sz="6" w:space="0" w:shadow="0" w:frame="0"/>
@@ -1190,7 +1190,7 @@
         </w:trPr>
         <w:tc>
           <w:tcPr>
-            <w:tcW w:type="dxa" w:w="3060"/>
+            <w:tcW w:type="dxa" w:w="2740"/>
             <w:tcBorders>
               <w:top w:val="single" w:color="666666" w:sz="6" w:space="0" w:shadow="0" w:frame="0"/>
               <w:left w:val="single" w:color="666666" w:sz="6" w:space="0" w:shadow="0" w:frame="0"/>
@@ -1222,7 +1222,7 @@
         </w:tc>
         <w:tc>
           <w:tcPr>
-            <w:tcW w:type="dxa" w:w="6300"/>
+            <w:tcW w:type="dxa" w:w="6620"/>
             <w:tcBorders>
               <w:top w:val="single" w:color="666666" w:sz="6" w:space="0" w:shadow="0" w:frame="0"/>
               <w:left w:val="single" w:color="666666" w:sz="6" w:space="0" w:shadow="0" w:frame="0"/>
@@ -1262,7 +1262,7 @@
         </w:trPr>
         <w:tc>
           <w:tcPr>
-            <w:tcW w:type="dxa" w:w="3060"/>
+            <w:tcW w:type="dxa" w:w="2740"/>
             <w:tcBorders>
               <w:top w:val="single" w:color="666666" w:sz="6" w:space="0" w:shadow="0" w:frame="0"/>
               <w:left w:val="single" w:color="666666" w:sz="6" w:space="0" w:shadow="0" w:frame="0"/>
@@ -1294,7 +1294,7 @@
         </w:tc>
         <w:tc>
           <w:tcPr>
-            <w:tcW w:type="dxa" w:w="6300"/>
+            <w:tcW w:type="dxa" w:w="6620"/>
             <w:tcBorders>
               <w:top w:val="single" w:color="666666" w:sz="6" w:space="0" w:shadow="0" w:frame="0"/>
               <w:left w:val="single" w:color="666666" w:sz="6" w:space="0" w:shadow="0" w:frame="0"/>
@@ -2296,8 +2296,7 @@
       </w:tblPr>
       <w:tblGrid>
         <w:gridCol w:w="2740"/>
-        <w:gridCol w:w="5620"/>
-        <w:gridCol w:w="1000"/>
+        <w:gridCol w:w="6620"/>
       </w:tblGrid>
       <w:tr>
         <w:tblPrEx>
@@ -2342,7 +2341,7 @@
         </w:tc>
         <w:tc>
           <w:tcPr>
-            <w:tcW w:type="dxa" w:w="5620"/>
+            <w:tcW w:type="dxa" w:w="6620"/>
             <w:tcBorders>
               <w:top w:val="single" w:color="666666" w:sz="6" w:space="0" w:shadow="0" w:frame="0"/>
               <w:left w:val="single" w:color="666666" w:sz="6" w:space="0" w:shadow="0" w:frame="0"/>
@@ -2371,41 +2370,6 @@
                 <w:lang w:val="en-US"/>
               </w:rPr>
               <w:t>{{vessel_name}}</w:t>
-            </w:r>
-          </w:p>
-        </w:tc>
-        <w:tc>
-          <w:tcPr>
-            <w:tcW w:type="dxa" w:w="1000"/>
-            <w:tcBorders>
-              <w:top w:val="single" w:color="666666" w:sz="6" w:space="0" w:shadow="0" w:frame="0"/>
-              <w:left w:val="single" w:color="666666" w:sz="6" w:space="0" w:shadow="0" w:frame="0"/>
-              <w:bottom w:val="single" w:color="666666" w:sz="6" w:space="0" w:shadow="0" w:frame="0"/>
-              <w:right w:val="single" w:color="666666" w:sz="6" w:space="0" w:shadow="0" w:frame="0"/>
-            </w:tcBorders>
-            <w:shd w:val="clear" w:color="auto" w:fill="b2b2b2"/>
-            <w:tcMar>
-              <w:top w:type="dxa" w:w="80"/>
-              <w:left w:type="dxa" w:w="80"/>
-              <w:bottom w:type="dxa" w:w="80"/>
-              <w:right w:type="dxa" w:w="80"/>
-            </w:tcMar>
-            <w:vAlign w:val="top"/>
-          </w:tcPr>
-          <w:p>
-            <w:pPr>
-              <w:jc w:val="right"/>
-              <w:pStyle w:val="Body A"/>
-            </w:pPr>
-            <w:r>
-              <w:rPr>
-                <w:b w:val="1"/>
-                <w:bCs w:val="1"/>
-                <w:shd w:val="nil" w:color="auto" w:fill="auto"/>
-                <w:rtl w:val="0"/>
-                <w:lang w:val="en-US"/>
-              </w:rPr>
-              <w:t>{{vessel_name_date}}</w:t>
             </w:r>
           </w:p>
         </w:tc>
@@ -2451,7 +2415,7 @@
         </w:tc>
         <w:tc>
           <w:tcPr>
-            <w:tcW w:type="dxa" w:w="5620"/>
+            <w:tcW w:type="dxa" w:w="6620"/>
             <w:tcBorders>
               <w:top w:val="single" w:color="666666" w:sz="6" w:space="0" w:shadow="0" w:frame="0"/>
               <w:left w:val="single" w:color="666666" w:sz="6" w:space="0" w:shadow="0" w:frame="0"/>
@@ -2478,39 +2442,6 @@
                 <w:lang w:val="en-US"/>
               </w:rPr>
               <w:t xml:space="preserve"> {{vessel_type}}</w:t>
-            </w:r>
-          </w:p>
-        </w:tc>
-        <w:tc>
-          <w:tcPr>
-            <w:tcW w:type="dxa" w:w="1000"/>
-            <w:tcBorders>
-              <w:top w:val="single" w:color="666666" w:sz="6" w:space="0" w:shadow="0" w:frame="0"/>
-              <w:left w:val="single" w:color="666666" w:sz="6" w:space="0" w:shadow="0" w:frame="0"/>
-              <w:bottom w:val="single" w:color="666666" w:sz="6" w:space="0" w:shadow="0" w:frame="0"/>
-              <w:right w:val="single" w:color="666666" w:sz="6" w:space="0" w:shadow="0" w:frame="0"/>
-            </w:tcBorders>
-            <w:shd w:val="clear" w:color="auto" w:fill="auto"/>
-            <w:tcMar>
-              <w:top w:type="dxa" w:w="80"/>
-              <w:left w:type="dxa" w:w="80"/>
-              <w:bottom w:type="dxa" w:w="80"/>
-              <w:right w:type="dxa" w:w="80"/>
-            </w:tcMar>
-            <w:vAlign w:val="top"/>
-          </w:tcPr>
-          <w:p>
-            <w:pPr>
-              <w:jc w:val="right"/>
-              <w:pStyle w:val="Body A"/>
-            </w:pPr>
-            <w:r>
-              <w:rPr>
-                <w:shd w:val="nil" w:color="auto" w:fill="auto"/>
-                <w:rtl w:val="0"/>
-                <w:lang w:val="en-US"/>
-              </w:rPr>
-              <w:t>{{vessel_type_date}}</w:t>
             </w:r>
           </w:p>
         </w:tc>
@@ -2556,7 +2487,7 @@
         </w:tc>
         <w:tc>
           <w:tcPr>
-            <w:tcW w:type="dxa" w:w="5620"/>
+            <w:tcW w:type="dxa" w:w="6620"/>
             <w:tcBorders>
               <w:top w:val="single" w:color="666666" w:sz="6" w:space="0" w:shadow="0" w:frame="0"/>
               <w:left w:val="single" w:color="666666" w:sz="6" w:space="0" w:shadow="0" w:frame="0"/>
@@ -2583,39 +2514,6 @@
                 <w:lang w:val="en-US"/>
               </w:rPr>
               <w:t xml:space="preserve"> {{vessel_manufacturer}}</w:t>
-            </w:r>
-          </w:p>
-        </w:tc>
-        <w:tc>
-          <w:tcPr>
-            <w:tcW w:type="dxa" w:w="1000"/>
-            <w:tcBorders>
-              <w:top w:val="single" w:color="666666" w:sz="6" w:space="0" w:shadow="0" w:frame="0"/>
-              <w:left w:val="single" w:color="666666" w:sz="6" w:space="0" w:shadow="0" w:frame="0"/>
-              <w:bottom w:val="single" w:color="666666" w:sz="6" w:space="0" w:shadow="0" w:frame="0"/>
-              <w:right w:val="single" w:color="666666" w:sz="6" w:space="0" w:shadow="0" w:frame="0"/>
-            </w:tcBorders>
-            <w:shd w:val="clear" w:color="auto" w:fill="eeeeee"/>
-            <w:tcMar>
-              <w:top w:type="dxa" w:w="80"/>
-              <w:left w:type="dxa" w:w="80"/>
-              <w:bottom w:type="dxa" w:w="80"/>
-              <w:right w:type="dxa" w:w="80"/>
-            </w:tcMar>
-            <w:vAlign w:val="top"/>
-          </w:tcPr>
-          <w:p>
-            <w:pPr>
-              <w:jc w:val="right"/>
-              <w:pStyle w:val="Body A"/>
-            </w:pPr>
-            <w:r>
-              <w:rPr>
-                <w:shd w:val="nil" w:color="auto" w:fill="auto"/>
-                <w:rtl w:val="0"/>
-                <w:lang w:val="en-US"/>
-              </w:rPr>
-              <w:t>{{vessel_manufacturer_date}}</w:t>
             </w:r>
           </w:p>
         </w:tc>
@@ -2661,7 +2559,7 @@
         </w:tc>
         <w:tc>
           <w:tcPr>
-            <w:tcW w:type="dxa" w:w="5620"/>
+            <w:tcW w:type="dxa" w:w="6620"/>
             <w:tcBorders>
               <w:top w:val="single" w:color="666666" w:sz="6" w:space="0" w:shadow="0" w:frame="0"/>
               <w:left w:val="single" w:color="666666" w:sz="6" w:space="0" w:shadow="0" w:frame="0"/>
@@ -2688,39 +2586,6 @@
                 <w:lang w:val="en-US"/>
               </w:rPr>
               <w:t xml:space="preserve"> {{vessel_designer}}</w:t>
-            </w:r>
-          </w:p>
-        </w:tc>
-        <w:tc>
-          <w:tcPr>
-            <w:tcW w:type="dxa" w:w="1000"/>
-            <w:tcBorders>
-              <w:top w:val="single" w:color="666666" w:sz="6" w:space="0" w:shadow="0" w:frame="0"/>
-              <w:left w:val="single" w:color="666666" w:sz="6" w:space="0" w:shadow="0" w:frame="0"/>
-              <w:bottom w:val="single" w:color="666666" w:sz="6" w:space="0" w:shadow="0" w:frame="0"/>
-              <w:right w:val="single" w:color="666666" w:sz="6" w:space="0" w:shadow="0" w:frame="0"/>
-            </w:tcBorders>
-            <w:shd w:val="clear" w:color="auto" w:fill="auto"/>
-            <w:tcMar>
-              <w:top w:type="dxa" w:w="80"/>
-              <w:left w:type="dxa" w:w="80"/>
-              <w:bottom w:type="dxa" w:w="80"/>
-              <w:right w:type="dxa" w:w="80"/>
-            </w:tcMar>
-            <w:vAlign w:val="top"/>
-          </w:tcPr>
-          <w:p>
-            <w:pPr>
-              <w:jc w:val="right"/>
-              <w:pStyle w:val="Body A"/>
-            </w:pPr>
-            <w:r>
-              <w:rPr>
-                <w:shd w:val="nil" w:color="auto" w:fill="auto"/>
-                <w:rtl w:val="0"/>
-                <w:lang w:val="en-US"/>
-              </w:rPr>
-              <w:t>{{vessel_designer_date}}</w:t>
             </w:r>
           </w:p>
         </w:tc>
@@ -2766,7 +2631,7 @@
         </w:tc>
         <w:tc>
           <w:tcPr>
-            <w:tcW w:type="dxa" w:w="5620"/>
+            <w:tcW w:type="dxa" w:w="6620"/>
             <w:tcBorders>
               <w:top w:val="single" w:color="666666" w:sz="6" w:space="0" w:shadow="0" w:frame="0"/>
               <w:left w:val="single" w:color="666666" w:sz="6" w:space="0" w:shadow="0" w:frame="0"/>
@@ -2793,39 +2658,6 @@
                 <w:lang w:val="en-US"/>
               </w:rPr>
               <w:t xml:space="preserve"> {{vessel_make}}</w:t>
-            </w:r>
-          </w:p>
-        </w:tc>
-        <w:tc>
-          <w:tcPr>
-            <w:tcW w:type="dxa" w:w="1000"/>
-            <w:tcBorders>
-              <w:top w:val="single" w:color="666666" w:sz="6" w:space="0" w:shadow="0" w:frame="0"/>
-              <w:left w:val="single" w:color="666666" w:sz="6" w:space="0" w:shadow="0" w:frame="0"/>
-              <w:bottom w:val="single" w:color="666666" w:sz="6" w:space="0" w:shadow="0" w:frame="0"/>
-              <w:right w:val="single" w:color="666666" w:sz="6" w:space="0" w:shadow="0" w:frame="0"/>
-            </w:tcBorders>
-            <w:shd w:val="clear" w:color="auto" w:fill="eeeeee"/>
-            <w:tcMar>
-              <w:top w:type="dxa" w:w="80"/>
-              <w:left w:type="dxa" w:w="80"/>
-              <w:bottom w:type="dxa" w:w="80"/>
-              <w:right w:type="dxa" w:w="80"/>
-            </w:tcMar>
-            <w:vAlign w:val="top"/>
-          </w:tcPr>
-          <w:p>
-            <w:pPr>
-              <w:jc w:val="right"/>
-              <w:pStyle w:val="Body A"/>
-            </w:pPr>
-            <w:r>
-              <w:rPr>
-                <w:shd w:val="nil" w:color="auto" w:fill="auto"/>
-                <w:rtl w:val="0"/>
-                <w:lang w:val="en-US"/>
-              </w:rPr>
-              <w:t>{{vessel_make_date}}</w:t>
             </w:r>
           </w:p>
         </w:tc>
@@ -2872,7 +2704,7 @@
         </w:tc>
         <w:tc>
           <w:tcPr>
-            <w:tcW w:type="dxa" w:w="5620"/>
+            <w:tcW w:type="dxa" w:w="6620"/>
             <w:tcBorders>
               <w:top w:val="single" w:color="666666" w:sz="6" w:space="0" w:shadow="0" w:frame="0"/>
               <w:left w:val="single" w:color="666666" w:sz="6" w:space="0" w:shadow="0" w:frame="0"/>
@@ -2899,39 +2731,6 @@
                 <w:lang w:val="en-US"/>
               </w:rPr>
               <w:t xml:space="preserve"> {{vessel_model}}</w:t>
-            </w:r>
-          </w:p>
-        </w:tc>
-        <w:tc>
-          <w:tcPr>
-            <w:tcW w:type="dxa" w:w="1000"/>
-            <w:tcBorders>
-              <w:top w:val="single" w:color="666666" w:sz="6" w:space="0" w:shadow="0" w:frame="0"/>
-              <w:left w:val="single" w:color="666666" w:sz="6" w:space="0" w:shadow="0" w:frame="0"/>
-              <w:bottom w:val="single" w:color="666666" w:sz="6" w:space="0" w:shadow="0" w:frame="0"/>
-              <w:right w:val="single" w:color="666666" w:sz="6" w:space="0" w:shadow="0" w:frame="0"/>
-            </w:tcBorders>
-            <w:shd w:val="clear" w:color="auto" w:fill="auto"/>
-            <w:tcMar>
-              <w:top w:type="dxa" w:w="80"/>
-              <w:left w:type="dxa" w:w="80"/>
-              <w:bottom w:type="dxa" w:w="80"/>
-              <w:right w:type="dxa" w:w="80"/>
-            </w:tcMar>
-            <w:vAlign w:val="top"/>
-          </w:tcPr>
-          <w:p>
-            <w:pPr>
-              <w:jc w:val="right"/>
-              <w:pStyle w:val="Body A"/>
-            </w:pPr>
-            <w:r>
-              <w:rPr>
-                <w:shd w:val="nil" w:color="auto" w:fill="auto"/>
-                <w:rtl w:val="0"/>
-                <w:lang w:val="en-US"/>
-              </w:rPr>
-              <w:t>{{vessel_model_date}}</w:t>
             </w:r>
           </w:p>
         </w:tc>
@@ -2977,7 +2776,7 @@
         </w:tc>
         <w:tc>
           <w:tcPr>
-            <w:tcW w:type="dxa" w:w="5620"/>
+            <w:tcW w:type="dxa" w:w="6620"/>
             <w:tcBorders>
               <w:top w:val="single" w:color="666666" w:sz="6" w:space="0" w:shadow="0" w:frame="0"/>
               <w:left w:val="single" w:color="666666" w:sz="6" w:space="0" w:shadow="0" w:frame="0"/>
@@ -3004,39 +2803,6 @@
                 <w:lang w:val="en-US"/>
               </w:rPr>
               <w:t xml:space="preserve"> {{vessel_hin}}</w:t>
-            </w:r>
-          </w:p>
-        </w:tc>
-        <w:tc>
-          <w:tcPr>
-            <w:tcW w:type="dxa" w:w="1000"/>
-            <w:tcBorders>
-              <w:top w:val="single" w:color="666666" w:sz="6" w:space="0" w:shadow="0" w:frame="0"/>
-              <w:left w:val="single" w:color="666666" w:sz="6" w:space="0" w:shadow="0" w:frame="0"/>
-              <w:bottom w:val="single" w:color="666666" w:sz="6" w:space="0" w:shadow="0" w:frame="0"/>
-              <w:right w:val="single" w:color="666666" w:sz="6" w:space="0" w:shadow="0" w:frame="0"/>
-            </w:tcBorders>
-            <w:shd w:val="clear" w:color="auto" w:fill="auto"/>
-            <w:tcMar>
-              <w:top w:type="dxa" w:w="80"/>
-              <w:left w:type="dxa" w:w="80"/>
-              <w:bottom w:type="dxa" w:w="80"/>
-              <w:right w:type="dxa" w:w="80"/>
-            </w:tcMar>
-            <w:vAlign w:val="top"/>
-          </w:tcPr>
-          <w:p>
-            <w:pPr>
-              <w:jc w:val="right"/>
-              <w:pStyle w:val="Body A"/>
-            </w:pPr>
-            <w:r>
-              <w:rPr>
-                <w:shd w:val="nil" w:color="auto" w:fill="auto"/>
-                <w:rtl w:val="0"/>
-                <w:lang w:val="en-US"/>
-              </w:rPr>
-              <w:t>{{vessel_hin_date}}</w:t>
             </w:r>
           </w:p>
         </w:tc>
@@ -3082,7 +2848,7 @@
         </w:tc>
         <w:tc>
           <w:tcPr>
-            <w:tcW w:type="dxa" w:w="5620"/>
+            <w:tcW w:type="dxa" w:w="6620"/>
             <w:tcBorders>
               <w:top w:val="single" w:color="666666" w:sz="6" w:space="0" w:shadow="0" w:frame="0"/>
               <w:left w:val="single" w:color="666666" w:sz="6" w:space="0" w:shadow="0" w:frame="0"/>
@@ -3109,39 +2875,6 @@
                 <w:lang w:val="en-US"/>
               </w:rPr>
               <w:t xml:space="preserve"> {{vessel_uscg_number}}</w:t>
-            </w:r>
-          </w:p>
-        </w:tc>
-        <w:tc>
-          <w:tcPr>
-            <w:tcW w:type="dxa" w:w="1000"/>
-            <w:tcBorders>
-              <w:top w:val="single" w:color="666666" w:sz="6" w:space="0" w:shadow="0" w:frame="0"/>
-              <w:left w:val="single" w:color="666666" w:sz="6" w:space="0" w:shadow="0" w:frame="0"/>
-              <w:bottom w:val="single" w:color="666666" w:sz="6" w:space="0" w:shadow="0" w:frame="0"/>
-              <w:right w:val="single" w:color="666666" w:sz="6" w:space="0" w:shadow="0" w:frame="0"/>
-            </w:tcBorders>
-            <w:shd w:val="clear" w:color="auto" w:fill="eeeeee"/>
-            <w:tcMar>
-              <w:top w:type="dxa" w:w="80"/>
-              <w:left w:type="dxa" w:w="80"/>
-              <w:bottom w:type="dxa" w:w="80"/>
-              <w:right w:type="dxa" w:w="80"/>
-            </w:tcMar>
-            <w:vAlign w:val="top"/>
-          </w:tcPr>
-          <w:p>
-            <w:pPr>
-              <w:jc w:val="right"/>
-              <w:pStyle w:val="Body A"/>
-            </w:pPr>
-            <w:r>
-              <w:rPr>
-                <w:shd w:val="nil" w:color="auto" w:fill="auto"/>
-                <w:rtl w:val="0"/>
-                <w:lang w:val="en-US"/>
-              </w:rPr>
-              <w:t>{{vessel_uscg_number_date}}</w:t>
             </w:r>
           </w:p>
         </w:tc>
@@ -3187,7 +2920,7 @@
         </w:tc>
         <w:tc>
           <w:tcPr>
-            <w:tcW w:type="dxa" w:w="5620"/>
+            <w:tcW w:type="dxa" w:w="6620"/>
             <w:tcBorders>
               <w:top w:val="single" w:color="666666" w:sz="6" w:space="0" w:shadow="0" w:frame="0"/>
               <w:left w:val="single" w:color="666666" w:sz="6" w:space="0" w:shadow="0" w:frame="0"/>
@@ -3214,39 +2947,6 @@
                 <w:lang w:val="en-US"/>
               </w:rPr>
               <w:t xml:space="preserve"> {{vessel_uscg_expiry}}</w:t>
-            </w:r>
-          </w:p>
-        </w:tc>
-        <w:tc>
-          <w:tcPr>
-            <w:tcW w:type="dxa" w:w="1000"/>
-            <w:tcBorders>
-              <w:top w:val="single" w:color="666666" w:sz="6" w:space="0" w:shadow="0" w:frame="0"/>
-              <w:left w:val="single" w:color="666666" w:sz="6" w:space="0" w:shadow="0" w:frame="0"/>
-              <w:bottom w:val="single" w:color="666666" w:sz="6" w:space="0" w:shadow="0" w:frame="0"/>
-              <w:right w:val="single" w:color="666666" w:sz="6" w:space="0" w:shadow="0" w:frame="0"/>
-            </w:tcBorders>
-            <w:shd w:val="clear" w:color="auto" w:fill="auto"/>
-            <w:tcMar>
-              <w:top w:type="dxa" w:w="80"/>
-              <w:left w:type="dxa" w:w="80"/>
-              <w:bottom w:type="dxa" w:w="80"/>
-              <w:right w:type="dxa" w:w="80"/>
-            </w:tcMar>
-            <w:vAlign w:val="top"/>
-          </w:tcPr>
-          <w:p>
-            <w:pPr>
-              <w:jc w:val="right"/>
-              <w:pStyle w:val="Body A"/>
-            </w:pPr>
-            <w:r>
-              <w:rPr>
-                <w:shd w:val="nil" w:color="auto" w:fill="auto"/>
-                <w:rtl w:val="0"/>
-                <w:lang w:val="en-US"/>
-              </w:rPr>
-              <w:t>{{vessel_uscg_expiry_date}}</w:t>
             </w:r>
           </w:p>
         </w:tc>
@@ -3292,7 +2992,7 @@
         </w:tc>
         <w:tc>
           <w:tcPr>
-            <w:tcW w:type="dxa" w:w="5620"/>
+            <w:tcW w:type="dxa" w:w="6620"/>
             <w:tcBorders>
               <w:top w:val="single" w:color="666666" w:sz="6" w:space="0" w:shadow="0" w:frame="0"/>
               <w:left w:val="single" w:color="666666" w:sz="6" w:space="0" w:shadow="0" w:frame="0"/>
@@ -3319,39 +3019,6 @@
                 <w:lang w:val="en-US"/>
               </w:rPr>
               <w:t xml:space="preserve"> {{vessel_hailing_port}}</w:t>
-            </w:r>
-          </w:p>
-        </w:tc>
-        <w:tc>
-          <w:tcPr>
-            <w:tcW w:type="dxa" w:w="1000"/>
-            <w:tcBorders>
-              <w:top w:val="single" w:color="666666" w:sz="6" w:space="0" w:shadow="0" w:frame="0"/>
-              <w:left w:val="single" w:color="666666" w:sz="6" w:space="0" w:shadow="0" w:frame="0"/>
-              <w:bottom w:val="single" w:color="666666" w:sz="6" w:space="0" w:shadow="0" w:frame="0"/>
-              <w:right w:val="single" w:color="666666" w:sz="6" w:space="0" w:shadow="0" w:frame="0"/>
-            </w:tcBorders>
-            <w:shd w:val="clear" w:color="auto" w:fill="eeeeee"/>
-            <w:tcMar>
-              <w:top w:type="dxa" w:w="80"/>
-              <w:left w:type="dxa" w:w="80"/>
-              <w:bottom w:type="dxa" w:w="80"/>
-              <w:right w:type="dxa" w:w="80"/>
-            </w:tcMar>
-            <w:vAlign w:val="top"/>
-          </w:tcPr>
-          <w:p>
-            <w:pPr>
-              <w:jc w:val="right"/>
-              <w:pStyle w:val="Body A"/>
-            </w:pPr>
-            <w:r>
-              <w:rPr>
-                <w:shd w:val="nil" w:color="auto" w:fill="auto"/>
-                <w:rtl w:val="0"/>
-                <w:lang w:val="en-US"/>
-              </w:rPr>
-              <w:t>{{vessel_hailing_port_date}}</w:t>
             </w:r>
           </w:p>
         </w:tc>
@@ -3397,7 +3064,7 @@
         </w:tc>
         <w:tc>
           <w:tcPr>
-            <w:tcW w:type="dxa" w:w="5620"/>
+            <w:tcW w:type="dxa" w:w="6620"/>
             <w:tcBorders>
               <w:top w:val="single" w:color="666666" w:sz="6" w:space="0" w:shadow="0" w:frame="0"/>
               <w:left w:val="single" w:color="666666" w:sz="6" w:space="0" w:shadow="0" w:frame="0"/>
@@ -3424,39 +3091,6 @@
                 <w:lang w:val="en-US"/>
               </w:rPr>
               <w:t xml:space="preserve"> {{vessel_year}}</w:t>
-            </w:r>
-          </w:p>
-        </w:tc>
-        <w:tc>
-          <w:tcPr>
-            <w:tcW w:type="dxa" w:w="1000"/>
-            <w:tcBorders>
-              <w:top w:val="single" w:color="666666" w:sz="6" w:space="0" w:shadow="0" w:frame="0"/>
-              <w:left w:val="single" w:color="666666" w:sz="6" w:space="0" w:shadow="0" w:frame="0"/>
-              <w:bottom w:val="single" w:color="666666" w:sz="6" w:space="0" w:shadow="0" w:frame="0"/>
-              <w:right w:val="single" w:color="666666" w:sz="6" w:space="0" w:shadow="0" w:frame="0"/>
-            </w:tcBorders>
-            <w:shd w:val="clear" w:color="auto" w:fill="auto"/>
-            <w:tcMar>
-              <w:top w:type="dxa" w:w="80"/>
-              <w:left w:type="dxa" w:w="80"/>
-              <w:bottom w:type="dxa" w:w="80"/>
-              <w:right w:type="dxa" w:w="80"/>
-            </w:tcMar>
-            <w:vAlign w:val="top"/>
-          </w:tcPr>
-          <w:p>
-            <w:pPr>
-              <w:jc w:val="right"/>
-              <w:pStyle w:val="Body A"/>
-            </w:pPr>
-            <w:r>
-              <w:rPr>
-                <w:shd w:val="nil" w:color="auto" w:fill="auto"/>
-                <w:rtl w:val="0"/>
-                <w:lang w:val="en-US"/>
-              </w:rPr>
-              <w:t>{{vessel_year_date}}</w:t>
             </w:r>
           </w:p>
         </w:tc>
@@ -3502,7 +3136,7 @@
         </w:tc>
         <w:tc>
           <w:tcPr>
-            <w:tcW w:type="dxa" w:w="5620"/>
+            <w:tcW w:type="dxa" w:w="6620"/>
             <w:tcBorders>
               <w:top w:val="single" w:color="666666" w:sz="6" w:space="0" w:shadow="0" w:frame="0"/>
               <w:left w:val="single" w:color="666666" w:sz="6" w:space="0" w:shadow="0" w:frame="0"/>
@@ -3529,39 +3163,6 @@
                 <w:lang w:val="en-US"/>
               </w:rPr>
               <w:t xml:space="preserve"> {{vessel_service_area}}</w:t>
-            </w:r>
-          </w:p>
-        </w:tc>
-        <w:tc>
-          <w:tcPr>
-            <w:tcW w:type="dxa" w:w="1000"/>
-            <w:tcBorders>
-              <w:top w:val="single" w:color="666666" w:sz="6" w:space="0" w:shadow="0" w:frame="0"/>
-              <w:left w:val="single" w:color="666666" w:sz="6" w:space="0" w:shadow="0" w:frame="0"/>
-              <w:bottom w:val="single" w:color="666666" w:sz="6" w:space="0" w:shadow="0" w:frame="0"/>
-              <w:right w:val="single" w:color="666666" w:sz="6" w:space="0" w:shadow="0" w:frame="0"/>
-            </w:tcBorders>
-            <w:shd w:val="clear" w:color="auto" w:fill="eeeeee"/>
-            <w:tcMar>
-              <w:top w:type="dxa" w:w="80"/>
-              <w:left w:type="dxa" w:w="80"/>
-              <w:bottom w:type="dxa" w:w="80"/>
-              <w:right w:type="dxa" w:w="80"/>
-            </w:tcMar>
-            <w:vAlign w:val="top"/>
-          </w:tcPr>
-          <w:p>
-            <w:pPr>
-              <w:jc w:val="right"/>
-              <w:pStyle w:val="Body A"/>
-            </w:pPr>
-            <w:r>
-              <w:rPr>
-                <w:shd w:val="nil" w:color="auto" w:fill="auto"/>
-                <w:rtl w:val="0"/>
-                <w:lang w:val="en-US"/>
-              </w:rPr>
-              <w:t>{{vessel_service_area_date}}</w:t>
             </w:r>
           </w:p>
         </w:tc>
@@ -3607,7 +3208,7 @@
         </w:tc>
         <w:tc>
           <w:tcPr>
-            <w:tcW w:type="dxa" w:w="5620"/>
+            <w:tcW w:type="dxa" w:w="6620"/>
             <w:tcBorders>
               <w:top w:val="single" w:color="666666" w:sz="6" w:space="0" w:shadow="0" w:frame="0"/>
               <w:left w:val="single" w:color="666666" w:sz="6" w:space="0" w:shadow="0" w:frame="0"/>
@@ -3634,39 +3235,6 @@
                 <w:lang w:val="en-US"/>
               </w:rPr>
               <w:t xml:space="preserve"> {{vessel_loa}}</w:t>
-            </w:r>
-          </w:p>
-        </w:tc>
-        <w:tc>
-          <w:tcPr>
-            <w:tcW w:type="dxa" w:w="1000"/>
-            <w:tcBorders>
-              <w:top w:val="single" w:color="666666" w:sz="6" w:space="0" w:shadow="0" w:frame="0"/>
-              <w:left w:val="single" w:color="666666" w:sz="6" w:space="0" w:shadow="0" w:frame="0"/>
-              <w:bottom w:val="single" w:color="666666" w:sz="6" w:space="0" w:shadow="0" w:frame="0"/>
-              <w:right w:val="single" w:color="666666" w:sz="6" w:space="0" w:shadow="0" w:frame="0"/>
-            </w:tcBorders>
-            <w:shd w:val="clear" w:color="auto" w:fill="auto"/>
-            <w:tcMar>
-              <w:top w:type="dxa" w:w="80"/>
-              <w:left w:type="dxa" w:w="80"/>
-              <w:bottom w:type="dxa" w:w="80"/>
-              <w:right w:type="dxa" w:w="80"/>
-            </w:tcMar>
-            <w:vAlign w:val="top"/>
-          </w:tcPr>
-          <w:p>
-            <w:pPr>
-              <w:jc w:val="right"/>
-              <w:pStyle w:val="Body A"/>
-            </w:pPr>
-            <w:r>
-              <w:rPr>
-                <w:shd w:val="nil" w:color="auto" w:fill="auto"/>
-                <w:rtl w:val="0"/>
-                <w:lang w:val="en-US"/>
-              </w:rPr>
-              <w:t>{{vessel_loa_date}}</w:t>
             </w:r>
           </w:p>
         </w:tc>
@@ -3712,7 +3280,7 @@
         </w:tc>
         <w:tc>
           <w:tcPr>
-            <w:tcW w:type="dxa" w:w="5620"/>
+            <w:tcW w:type="dxa" w:w="6620"/>
             <w:tcBorders>
               <w:top w:val="single" w:color="666666" w:sz="6" w:space="0" w:shadow="0" w:frame="0"/>
               <w:left w:val="single" w:color="666666" w:sz="6" w:space="0" w:shadow="0" w:frame="0"/>
@@ -3739,39 +3307,6 @@
                 <w:lang w:val="en-US"/>
               </w:rPr>
               <w:t xml:space="preserve"> {{vessel_beam}}</w:t>
-            </w:r>
-          </w:p>
-        </w:tc>
-        <w:tc>
-          <w:tcPr>
-            <w:tcW w:type="dxa" w:w="1000"/>
-            <w:tcBorders>
-              <w:top w:val="single" w:color="666666" w:sz="6" w:space="0" w:shadow="0" w:frame="0"/>
-              <w:left w:val="single" w:color="666666" w:sz="6" w:space="0" w:shadow="0" w:frame="0"/>
-              <w:bottom w:val="single" w:color="666666" w:sz="6" w:space="0" w:shadow="0" w:frame="0"/>
-              <w:right w:val="single" w:color="666666" w:sz="6" w:space="0" w:shadow="0" w:frame="0"/>
-            </w:tcBorders>
-            <w:shd w:val="clear" w:color="auto" w:fill="eeeeee"/>
-            <w:tcMar>
-              <w:top w:type="dxa" w:w="80"/>
-              <w:left w:type="dxa" w:w="80"/>
-              <w:bottom w:type="dxa" w:w="80"/>
-              <w:right w:type="dxa" w:w="80"/>
-            </w:tcMar>
-            <w:vAlign w:val="top"/>
-          </w:tcPr>
-          <w:p>
-            <w:pPr>
-              <w:jc w:val="right"/>
-              <w:pStyle w:val="Body A"/>
-            </w:pPr>
-            <w:r>
-              <w:rPr>
-                <w:shd w:val="nil" w:color="auto" w:fill="auto"/>
-                <w:rtl w:val="0"/>
-                <w:lang w:val="en-US"/>
-              </w:rPr>
-              <w:t>{{vessel_beam_date}}</w:t>
             </w:r>
           </w:p>
         </w:tc>
@@ -3817,7 +3352,7 @@
         </w:tc>
         <w:tc>
           <w:tcPr>
-            <w:tcW w:type="dxa" w:w="5620"/>
+            <w:tcW w:type="dxa" w:w="6620"/>
             <w:tcBorders>
               <w:top w:val="single" w:color="666666" w:sz="6" w:space="0" w:shadow="0" w:frame="0"/>
               <w:left w:val="single" w:color="666666" w:sz="6" w:space="0" w:shadow="0" w:frame="0"/>
@@ -3844,39 +3379,6 @@
                 <w:lang w:val="en-US"/>
               </w:rPr>
               <w:t xml:space="preserve"> {{vessel_draft}}</w:t>
-            </w:r>
-          </w:p>
-        </w:tc>
-        <w:tc>
-          <w:tcPr>
-            <w:tcW w:type="dxa" w:w="1000"/>
-            <w:tcBorders>
-              <w:top w:val="single" w:color="666666" w:sz="6" w:space="0" w:shadow="0" w:frame="0"/>
-              <w:left w:val="single" w:color="666666" w:sz="6" w:space="0" w:shadow="0" w:frame="0"/>
-              <w:bottom w:val="single" w:color="666666" w:sz="6" w:space="0" w:shadow="0" w:frame="0"/>
-              <w:right w:val="single" w:color="666666" w:sz="6" w:space="0" w:shadow="0" w:frame="0"/>
-            </w:tcBorders>
-            <w:shd w:val="clear" w:color="auto" w:fill="auto"/>
-            <w:tcMar>
-              <w:top w:type="dxa" w:w="80"/>
-              <w:left w:type="dxa" w:w="80"/>
-              <w:bottom w:type="dxa" w:w="80"/>
-              <w:right w:type="dxa" w:w="80"/>
-            </w:tcMar>
-            <w:vAlign w:val="top"/>
-          </w:tcPr>
-          <w:p>
-            <w:pPr>
-              <w:jc w:val="right"/>
-              <w:pStyle w:val="Body A"/>
-            </w:pPr>
-            <w:r>
-              <w:rPr>
-                <w:shd w:val="nil" w:color="auto" w:fill="auto"/>
-                <w:rtl w:val="0"/>
-                <w:lang w:val="en-US"/>
-              </w:rPr>
-              <w:t>{{vessel_draft_date}}</w:t>
             </w:r>
           </w:p>
         </w:tc>
@@ -3922,7 +3424,7 @@
         </w:tc>
         <w:tc>
           <w:tcPr>
-            <w:tcW w:type="dxa" w:w="5620"/>
+            <w:tcW w:type="dxa" w:w="6620"/>
             <w:tcBorders>
               <w:top w:val="single" w:color="666666" w:sz="6" w:space="0" w:shadow="0" w:frame="0"/>
               <w:left w:val="single" w:color="666666" w:sz="6" w:space="0" w:shadow="0" w:frame="0"/>
@@ -3949,39 +3451,6 @@
                 <w:lang w:val="en-US"/>
               </w:rPr>
               <w:t xml:space="preserve"> {{vessel_displacement}}</w:t>
-            </w:r>
-          </w:p>
-        </w:tc>
-        <w:tc>
-          <w:tcPr>
-            <w:tcW w:type="dxa" w:w="1000"/>
-            <w:tcBorders>
-              <w:top w:val="single" w:color="666666" w:sz="6" w:space="0" w:shadow="0" w:frame="0"/>
-              <w:left w:val="single" w:color="666666" w:sz="6" w:space="0" w:shadow="0" w:frame="0"/>
-              <w:bottom w:val="single" w:color="666666" w:sz="6" w:space="0" w:shadow="0" w:frame="0"/>
-              <w:right w:val="single" w:color="666666" w:sz="6" w:space="0" w:shadow="0" w:frame="0"/>
-            </w:tcBorders>
-            <w:shd w:val="clear" w:color="auto" w:fill="eeeeee"/>
-            <w:tcMar>
-              <w:top w:type="dxa" w:w="80"/>
-              <w:left w:type="dxa" w:w="80"/>
-              <w:bottom w:type="dxa" w:w="80"/>
-              <w:right w:type="dxa" w:w="80"/>
-            </w:tcMar>
-            <w:vAlign w:val="top"/>
-          </w:tcPr>
-          <w:p>
-            <w:pPr>
-              <w:jc w:val="right"/>
-              <w:pStyle w:val="Body A"/>
-            </w:pPr>
-            <w:r>
-              <w:rPr>
-                <w:shd w:val="nil" w:color="auto" w:fill="auto"/>
-                <w:rtl w:val="0"/>
-                <w:lang w:val="en-US"/>
-              </w:rPr>
-              <w:t>{{vessel_displacement_date}}</w:t>
             </w:r>
           </w:p>
         </w:tc>
@@ -4027,7 +3496,7 @@
         </w:tc>
         <w:tc>
           <w:tcPr>
-            <w:tcW w:type="dxa" w:w="5620"/>
+            <w:tcW w:type="dxa" w:w="6620"/>
             <w:tcBorders>
               <w:top w:val="single" w:color="666666" w:sz="6" w:space="0" w:shadow="0" w:frame="0"/>
               <w:left w:val="single" w:color="666666" w:sz="6" w:space="0" w:shadow="0" w:frame="0"/>
@@ -4054,39 +3523,6 @@
                 <w:lang w:val="en-US"/>
               </w:rPr>
               <w:t xml:space="preserve"> {{vessel_ballast}}</w:t>
-            </w:r>
-          </w:p>
-        </w:tc>
-        <w:tc>
-          <w:tcPr>
-            <w:tcW w:type="dxa" w:w="1000"/>
-            <w:tcBorders>
-              <w:top w:val="single" w:color="666666" w:sz="6" w:space="0" w:shadow="0" w:frame="0"/>
-              <w:left w:val="single" w:color="666666" w:sz="6" w:space="0" w:shadow="0" w:frame="0"/>
-              <w:bottom w:val="single" w:color="666666" w:sz="6" w:space="0" w:shadow="0" w:frame="0"/>
-              <w:right w:val="single" w:color="666666" w:sz="6" w:space="0" w:shadow="0" w:frame="0"/>
-            </w:tcBorders>
-            <w:shd w:val="clear" w:color="auto" w:fill="eeeeee"/>
-            <w:tcMar>
-              <w:top w:type="dxa" w:w="80"/>
-              <w:left w:type="dxa" w:w="80"/>
-              <w:bottom w:type="dxa" w:w="80"/>
-              <w:right w:type="dxa" w:w="80"/>
-            </w:tcMar>
-            <w:vAlign w:val="top"/>
-          </w:tcPr>
-          <w:p>
-            <w:pPr>
-              <w:jc w:val="right"/>
-              <w:pStyle w:val="Body A"/>
-            </w:pPr>
-            <w:r>
-              <w:rPr>
-                <w:shd w:val="nil" w:color="auto" w:fill="auto"/>
-                <w:rtl w:val="0"/>
-                <w:lang w:val="en-US"/>
-              </w:rPr>
-              <w:t>{{vessel_ballast_date}}</w:t>
             </w:r>
           </w:p>
         </w:tc>
@@ -36292,7 +35728,7 @@
           <w:rtl w:val="0"/>
           <w:lang w:val="en-US"/>
         </w:rPr>
-        <w:t>{% for line in aa_findings_list %}</w:t>
+        <w:t xml:space="preserve">{%p for f in aa_findings_items %}</w:t>
       </w:r>
     </w:p>
     <w:p>
@@ -36309,7 +35745,7 @@
           <w:rtl w:val="0"/>
           <w:lang w:val="en-US"/>
         </w:rPr>
-        <w:t>{{ line }}</w:t>
+        <w:t xml:space="preserve">{{ f.text }}</w:t>
       </w:r>
     </w:p>
     <w:p>
@@ -36326,7 +35762,59 @@
           <w:rtl w:val="0"/>
           <w:lang w:val="en-US"/>
         </w:rPr>
-        <w:t>{% endfor %}</w:t>
+        <w:t xml:space="preserve">{%p if f.photo %}</w:t>
+      </w:r>
+    </w:p>
+    <w:p>
+      <w:pPr>
+        <w:pStyle w:val="Default"/>
+        <w:spacing w:before="0" w:line="240" w:lineRule="auto"/>
+        <w:jc w:val="center"/>
+        <w:rPr>
+          <w:rFonts w:ascii="Arial" w:cs="Arial" w:hAnsi="Arial" w:eastAsia="Arial"/>
+        </w:rPr>
+      </w:pPr>
+      <w:r>
+        <w:rPr>
+          <w:rFonts w:ascii="Arial" w:hAnsi="Arial"/>
+          <w:rtl w:val="0"/>
+          <w:lang w:val="en-US"/>
+        </w:rPr>
+        <w:t xml:space="preserve">{{ f.photo }}</w:t>
+      </w:r>
+    </w:p>
+    <w:p>
+      <w:pPr>
+        <w:pStyle w:val="Default"/>
+        <w:spacing w:before="0" w:line="240" w:lineRule="auto"/>
+        <w:rPr>
+          <w:rFonts w:ascii="Arial" w:cs="Arial" w:hAnsi="Arial" w:eastAsia="Arial"/>
+        </w:rPr>
+      </w:pPr>
+      <w:r>
+        <w:rPr>
+          <w:rFonts w:ascii="Arial" w:hAnsi="Arial"/>
+          <w:rtl w:val="0"/>
+          <w:lang w:val="en-US"/>
+        </w:rPr>
+        <w:t xml:space="preserve">{%p endif %}</w:t>
+      </w:r>
+    </w:p>
+    <w:p>
+      <w:pPr>
+        <w:pStyle w:val="Default"/>
+        <w:spacing w:before="0" w:line="240" w:lineRule="auto"/>
+        <w:rPr>
+          <w:rFonts w:ascii="Arial" w:cs="Arial" w:hAnsi="Arial" w:eastAsia="Arial"/>
+        </w:rPr>
+      </w:pPr>
+      <w:r>
+        <w:rPr>
+          <w:rFonts w:ascii="Arial" w:hAnsi="Arial"/>
+          <w:rtl w:val="0"/>
+          <w:lang w:val="en-US"/>
+        </w:rPr>
+        <w:t xml:space="preserve">{%p endfor %}</w:t>
       </w:r>
     </w:p>
     <w:p>
@@ -36377,19 +35865,15 @@
         <w:spacing w:before="0" w:line="240" w:lineRule="auto"/>
         <w:rPr>
           <w:rFonts w:ascii="Arial" w:cs="Arial" w:hAnsi="Arial" w:eastAsia="Arial"/>
-          <w:sz w:val="22"/>
-          <w:szCs w:val="22"/>
         </w:rPr>
       </w:pPr>
       <w:r>
         <w:rPr>
           <w:rFonts w:ascii="Arial" w:hAnsi="Arial"/>
-          <w:sz w:val="22"/>
-          <w:szCs w:val="22"/>
           <w:rtl w:val="0"/>
           <w:lang w:val="en-US"/>
         </w:rPr>
-        <w:t>{% for line in a_findings_list %}</w:t>
+        <w:t xml:space="preserve">{%p for f in a_findings_items %}</w:t>
       </w:r>
     </w:p>
     <w:p>
@@ -36398,19 +35882,15 @@
         <w:spacing w:before="0" w:line="240" w:lineRule="auto"/>
         <w:rPr>
           <w:rFonts w:ascii="Arial" w:cs="Arial" w:hAnsi="Arial" w:eastAsia="Arial"/>
-          <w:sz w:val="22"/>
-          <w:szCs w:val="22"/>
         </w:rPr>
       </w:pPr>
       <w:r>
         <w:rPr>
           <w:rFonts w:ascii="Arial" w:hAnsi="Arial"/>
-          <w:sz w:val="22"/>
-          <w:szCs w:val="22"/>
           <w:rtl w:val="0"/>
           <w:lang w:val="en-US"/>
         </w:rPr>
-        <w:t>{{ line }}</w:t>
+        <w:t xml:space="preserve">{{ f.text }}</w:t>
       </w:r>
     </w:p>
     <w:p>
@@ -36419,19 +35899,67 @@
         <w:spacing w:before="0" w:line="240" w:lineRule="auto"/>
         <w:rPr>
           <w:rFonts w:ascii="Arial" w:cs="Arial" w:hAnsi="Arial" w:eastAsia="Arial"/>
-          <w:sz w:val="22"/>
-          <w:szCs w:val="22"/>
         </w:rPr>
       </w:pPr>
       <w:r>
         <w:rPr>
           <w:rFonts w:ascii="Arial" w:hAnsi="Arial"/>
-          <w:sz w:val="22"/>
-          <w:szCs w:val="22"/>
           <w:rtl w:val="0"/>
           <w:lang w:val="en-US"/>
         </w:rPr>
-        <w:t>{% endfor %}</w:t>
+        <w:t xml:space="preserve">{%p if f.photo %}</w:t>
+      </w:r>
+    </w:p>
+    <w:p>
+      <w:pPr>
+        <w:pStyle w:val="Default"/>
+        <w:spacing w:before="0" w:line="240" w:lineRule="auto"/>
+        <w:jc w:val="center"/>
+        <w:rPr>
+          <w:rFonts w:ascii="Arial" w:cs="Arial" w:hAnsi="Arial" w:eastAsia="Arial"/>
+        </w:rPr>
+      </w:pPr>
+      <w:r>
+        <w:rPr>
+          <w:rFonts w:ascii="Arial" w:hAnsi="Arial"/>
+          <w:rtl w:val="0"/>
+          <w:lang w:val="en-US"/>
+        </w:rPr>
+        <w:t xml:space="preserve">{{ f.photo }}</w:t>
+      </w:r>
+    </w:p>
+    <w:p>
+      <w:pPr>
+        <w:pStyle w:val="Default"/>
+        <w:spacing w:before="0" w:line="240" w:lineRule="auto"/>
+        <w:rPr>
+          <w:rFonts w:ascii="Arial" w:cs="Arial" w:hAnsi="Arial" w:eastAsia="Arial"/>
+        </w:rPr>
+      </w:pPr>
+      <w:r>
+        <w:rPr>
+          <w:rFonts w:ascii="Arial" w:hAnsi="Arial"/>
+          <w:rtl w:val="0"/>
+          <w:lang w:val="en-US"/>
+        </w:rPr>
+        <w:t xml:space="preserve">{%p endif %}</w:t>
+      </w:r>
+    </w:p>
+    <w:p>
+      <w:pPr>
+        <w:pStyle w:val="Default"/>
+        <w:spacing w:before="0" w:line="240" w:lineRule="auto"/>
+        <w:rPr>
+          <w:rFonts w:ascii="Arial" w:cs="Arial" w:hAnsi="Arial" w:eastAsia="Arial"/>
+        </w:rPr>
+      </w:pPr>
+      <w:r>
+        <w:rPr>
+          <w:rFonts w:ascii="Arial" w:hAnsi="Arial"/>
+          <w:rtl w:val="0"/>
+          <w:lang w:val="en-US"/>
+        </w:rPr>
+        <w:t xml:space="preserve">{%p endfor %}</w:t>
       </w:r>
     </w:p>
     <w:p>
@@ -36472,19 +36000,15 @@
         <w:spacing w:before="0" w:line="240" w:lineRule="auto"/>
         <w:rPr>
           <w:rFonts w:ascii="Arial" w:cs="Arial" w:hAnsi="Arial" w:eastAsia="Arial"/>
-          <w:sz w:val="22"/>
-          <w:szCs w:val="22"/>
         </w:rPr>
       </w:pPr>
       <w:r>
         <w:rPr>
           <w:rFonts w:ascii="Arial" w:hAnsi="Arial"/>
-          <w:sz w:val="22"/>
-          <w:szCs w:val="22"/>
           <w:rtl w:val="0"/>
           <w:lang w:val="en-US"/>
         </w:rPr>
-        <w:t>{% for line in b_findings_list %}</w:t>
+        <w:t xml:space="preserve">{%p for f in b_findings_items %}</w:t>
       </w:r>
     </w:p>
     <w:p>
@@ -36493,19 +36017,15 @@
         <w:spacing w:before="0" w:line="240" w:lineRule="auto"/>
         <w:rPr>
           <w:rFonts w:ascii="Arial" w:cs="Arial" w:hAnsi="Arial" w:eastAsia="Arial"/>
-          <w:sz w:val="22"/>
-          <w:szCs w:val="22"/>
         </w:rPr>
       </w:pPr>
       <w:r>
         <w:rPr>
           <w:rFonts w:ascii="Arial" w:hAnsi="Arial"/>
-          <w:sz w:val="22"/>
-          <w:szCs w:val="22"/>
           <w:rtl w:val="0"/>
           <w:lang w:val="en-US"/>
         </w:rPr>
-        <w:t>{{ line }}</w:t>
+        <w:t xml:space="preserve">{{ f.text }}</w:t>
       </w:r>
     </w:p>
     <w:p>
@@ -36514,19 +36034,67 @@
         <w:spacing w:before="0" w:line="240" w:lineRule="auto"/>
         <w:rPr>
           <w:rFonts w:ascii="Arial" w:cs="Arial" w:hAnsi="Arial" w:eastAsia="Arial"/>
-          <w:sz w:val="22"/>
-          <w:szCs w:val="22"/>
         </w:rPr>
       </w:pPr>
       <w:r>
         <w:rPr>
           <w:rFonts w:ascii="Arial" w:hAnsi="Arial"/>
-          <w:sz w:val="22"/>
-          <w:szCs w:val="22"/>
           <w:rtl w:val="0"/>
           <w:lang w:val="en-US"/>
         </w:rPr>
-        <w:t>{% endfor %}</w:t>
+        <w:t xml:space="preserve">{%p if f.photo %}</w:t>
+      </w:r>
+    </w:p>
+    <w:p>
+      <w:pPr>
+        <w:pStyle w:val="Default"/>
+        <w:spacing w:before="0" w:line="240" w:lineRule="auto"/>
+        <w:jc w:val="center"/>
+        <w:rPr>
+          <w:rFonts w:ascii="Arial" w:cs="Arial" w:hAnsi="Arial" w:eastAsia="Arial"/>
+        </w:rPr>
+      </w:pPr>
+      <w:r>
+        <w:rPr>
+          <w:rFonts w:ascii="Arial" w:hAnsi="Arial"/>
+          <w:rtl w:val="0"/>
+          <w:lang w:val="en-US"/>
+        </w:rPr>
+        <w:t xml:space="preserve">{{ f.photo }}</w:t>
+      </w:r>
+    </w:p>
+    <w:p>
+      <w:pPr>
+        <w:pStyle w:val="Default"/>
+        <w:spacing w:before="0" w:line="240" w:lineRule="auto"/>
+        <w:rPr>
+          <w:rFonts w:ascii="Arial" w:cs="Arial" w:hAnsi="Arial" w:eastAsia="Arial"/>
+        </w:rPr>
+      </w:pPr>
+      <w:r>
+        <w:rPr>
+          <w:rFonts w:ascii="Arial" w:hAnsi="Arial"/>
+          <w:rtl w:val="0"/>
+          <w:lang w:val="en-US"/>
+        </w:rPr>
+        <w:t xml:space="preserve">{%p endif %}</w:t>
+      </w:r>
+    </w:p>
+    <w:p>
+      <w:pPr>
+        <w:pStyle w:val="Default"/>
+        <w:spacing w:before="0" w:line="240" w:lineRule="auto"/>
+        <w:rPr>
+          <w:rFonts w:ascii="Arial" w:cs="Arial" w:hAnsi="Arial" w:eastAsia="Arial"/>
+        </w:rPr>
+      </w:pPr>
+      <w:r>
+        <w:rPr>
+          <w:rFonts w:ascii="Arial" w:hAnsi="Arial"/>
+          <w:rtl w:val="0"/>
+          <w:lang w:val="en-US"/>
+        </w:rPr>
+        <w:t xml:space="preserve">{%p endfor %}</w:t>
       </w:r>
     </w:p>
     <w:p>
@@ -36567,19 +36135,15 @@
         <w:spacing w:before="0" w:line="240" w:lineRule="auto"/>
         <w:rPr>
           <w:rFonts w:ascii="Arial" w:cs="Arial" w:hAnsi="Arial" w:eastAsia="Arial"/>
-          <w:sz w:val="22"/>
-          <w:szCs w:val="22"/>
         </w:rPr>
       </w:pPr>
       <w:r>
         <w:rPr>
           <w:rFonts w:ascii="Arial" w:hAnsi="Arial"/>
-          <w:sz w:val="22"/>
-          <w:szCs w:val="22"/>
           <w:rtl w:val="0"/>
           <w:lang w:val="en-US"/>
         </w:rPr>
-        <w:t>{% for line in c_findings_list %}</w:t>
+        <w:t xml:space="preserve">{%p for f in c_findings_items %}</w:t>
       </w:r>
     </w:p>
     <w:p>
@@ -36588,19 +36152,15 @@
         <w:spacing w:before="0" w:line="240" w:lineRule="auto"/>
         <w:rPr>
           <w:rFonts w:ascii="Arial" w:cs="Arial" w:hAnsi="Arial" w:eastAsia="Arial"/>
-          <w:sz w:val="22"/>
-          <w:szCs w:val="22"/>
         </w:rPr>
       </w:pPr>
       <w:r>
         <w:rPr>
           <w:rFonts w:ascii="Arial" w:hAnsi="Arial"/>
-          <w:sz w:val="22"/>
-          <w:szCs w:val="22"/>
           <w:rtl w:val="0"/>
           <w:lang w:val="en-US"/>
         </w:rPr>
-        <w:t>{{ line }}</w:t>
+        <w:t xml:space="preserve">{{ f.text }}</w:t>
       </w:r>
     </w:p>
     <w:p>
@@ -36609,19 +36169,67 @@
         <w:spacing w:before="0" w:line="240" w:lineRule="auto"/>
         <w:rPr>
           <w:rFonts w:ascii="Arial" w:cs="Arial" w:hAnsi="Arial" w:eastAsia="Arial"/>
-          <w:sz w:val="22"/>
-          <w:szCs w:val="22"/>
         </w:rPr>
       </w:pPr>
       <w:r>
         <w:rPr>
           <w:rFonts w:ascii="Arial" w:hAnsi="Arial"/>
-          <w:sz w:val="22"/>
-          <w:szCs w:val="22"/>
           <w:rtl w:val="0"/>
           <w:lang w:val="en-US"/>
         </w:rPr>
-        <w:t>{% endfor %}</w:t>
+        <w:t xml:space="preserve">{%p if f.photo %}</w:t>
+      </w:r>
+    </w:p>
+    <w:p>
+      <w:pPr>
+        <w:pStyle w:val="Default"/>
+        <w:spacing w:before="0" w:line="240" w:lineRule="auto"/>
+        <w:jc w:val="center"/>
+        <w:rPr>
+          <w:rFonts w:ascii="Arial" w:cs="Arial" w:hAnsi="Arial" w:eastAsia="Arial"/>
+        </w:rPr>
+      </w:pPr>
+      <w:r>
+        <w:rPr>
+          <w:rFonts w:ascii="Arial" w:hAnsi="Arial"/>
+          <w:rtl w:val="0"/>
+          <w:lang w:val="en-US"/>
+        </w:rPr>
+        <w:t xml:space="preserve">{{ f.photo }}</w:t>
+      </w:r>
+    </w:p>
+    <w:p>
+      <w:pPr>
+        <w:pStyle w:val="Default"/>
+        <w:spacing w:before="0" w:line="240" w:lineRule="auto"/>
+        <w:rPr>
+          <w:rFonts w:ascii="Arial" w:cs="Arial" w:hAnsi="Arial" w:eastAsia="Arial"/>
+        </w:rPr>
+      </w:pPr>
+      <w:r>
+        <w:rPr>
+          <w:rFonts w:ascii="Arial" w:hAnsi="Arial"/>
+          <w:rtl w:val="0"/>
+          <w:lang w:val="en-US"/>
+        </w:rPr>
+        <w:t xml:space="preserve">{%p endif %}</w:t>
+      </w:r>
+    </w:p>
+    <w:p>
+      <w:pPr>
+        <w:pStyle w:val="Default"/>
+        <w:spacing w:before="0" w:line="240" w:lineRule="auto"/>
+        <w:rPr>
+          <w:rFonts w:ascii="Arial" w:cs="Arial" w:hAnsi="Arial" w:eastAsia="Arial"/>
+        </w:rPr>
+      </w:pPr>
+      <w:r>
+        <w:rPr>
+          <w:rFonts w:ascii="Arial" w:hAnsi="Arial"/>
+          <w:rtl w:val="0"/>
+          <w:lang w:val="en-US"/>
+        </w:rPr>
+        <w:t xml:space="preserve">{%p endfor %}</w:t>
       </w:r>
     </w:p>
     <w:p>
@@ -36660,19 +36268,15 @@
         <w:spacing w:before="0" w:line="240" w:lineRule="auto"/>
         <w:rPr>
           <w:rFonts w:ascii="Arial" w:cs="Arial" w:hAnsi="Arial" w:eastAsia="Arial"/>
-          <w:sz w:val="22"/>
-          <w:szCs w:val="22"/>
         </w:rPr>
       </w:pPr>
       <w:r>
         <w:rPr>
           <w:rFonts w:ascii="Arial" w:hAnsi="Arial"/>
-          <w:sz w:val="22"/>
-          <w:szCs w:val="22"/>
           <w:rtl w:val="0"/>
           <w:lang w:val="en-US"/>
         </w:rPr>
-        <w:t>{% for line in monitor_findings_list %}</w:t>
+        <w:t xml:space="preserve">{%p for f in monitor_findings_items %}</w:t>
       </w:r>
     </w:p>
     <w:p>
@@ -36681,19 +36285,15 @@
         <w:spacing w:before="0" w:line="240" w:lineRule="auto"/>
         <w:rPr>
           <w:rFonts w:ascii="Arial" w:cs="Arial" w:hAnsi="Arial" w:eastAsia="Arial"/>
-          <w:sz w:val="22"/>
-          <w:szCs w:val="22"/>
         </w:rPr>
       </w:pPr>
       <w:r>
         <w:rPr>
           <w:rFonts w:ascii="Arial" w:hAnsi="Arial"/>
-          <w:sz w:val="22"/>
-          <w:szCs w:val="22"/>
           <w:rtl w:val="0"/>
           <w:lang w:val="en-US"/>
         </w:rPr>
-        <w:t>{{ line }}</w:t>
+        <w:t xml:space="preserve">{{ f.text }}</w:t>
       </w:r>
     </w:p>
     <w:p>
@@ -36702,19 +36302,67 @@
         <w:spacing w:before="0" w:line="240" w:lineRule="auto"/>
         <w:rPr>
           <w:rFonts w:ascii="Arial" w:cs="Arial" w:hAnsi="Arial" w:eastAsia="Arial"/>
-          <w:sz w:val="22"/>
-          <w:szCs w:val="22"/>
         </w:rPr>
       </w:pPr>
       <w:r>
         <w:rPr>
           <w:rFonts w:ascii="Arial" w:hAnsi="Arial"/>
-          <w:sz w:val="22"/>
-          <w:szCs w:val="22"/>
           <w:rtl w:val="0"/>
           <w:lang w:val="en-US"/>
         </w:rPr>
-        <w:t>{% endfor %}</w:t>
+        <w:t xml:space="preserve">{%p if f.photo %}</w:t>
+      </w:r>
+    </w:p>
+    <w:p>
+      <w:pPr>
+        <w:pStyle w:val="Default"/>
+        <w:spacing w:before="0" w:line="240" w:lineRule="auto"/>
+        <w:jc w:val="center"/>
+        <w:rPr>
+          <w:rFonts w:ascii="Arial" w:cs="Arial" w:hAnsi="Arial" w:eastAsia="Arial"/>
+        </w:rPr>
+      </w:pPr>
+      <w:r>
+        <w:rPr>
+          <w:rFonts w:ascii="Arial" w:hAnsi="Arial"/>
+          <w:rtl w:val="0"/>
+          <w:lang w:val="en-US"/>
+        </w:rPr>
+        <w:t xml:space="preserve">{{ f.photo }}</w:t>
+      </w:r>
+    </w:p>
+    <w:p>
+      <w:pPr>
+        <w:pStyle w:val="Default"/>
+        <w:spacing w:before="0" w:line="240" w:lineRule="auto"/>
+        <w:rPr>
+          <w:rFonts w:ascii="Arial" w:cs="Arial" w:hAnsi="Arial" w:eastAsia="Arial"/>
+        </w:rPr>
+      </w:pPr>
+      <w:r>
+        <w:rPr>
+          <w:rFonts w:ascii="Arial" w:hAnsi="Arial"/>
+          <w:rtl w:val="0"/>
+          <w:lang w:val="en-US"/>
+        </w:rPr>
+        <w:t xml:space="preserve">{%p endif %}</w:t>
+      </w:r>
+    </w:p>
+    <w:p>
+      <w:pPr>
+        <w:pStyle w:val="Default"/>
+        <w:spacing w:before="0" w:line="240" w:lineRule="auto"/>
+        <w:rPr>
+          <w:rFonts w:ascii="Arial" w:cs="Arial" w:hAnsi="Arial" w:eastAsia="Arial"/>
+        </w:rPr>
+      </w:pPr>
+      <w:r>
+        <w:rPr>
+          <w:rFonts w:ascii="Arial" w:hAnsi="Arial"/>
+          <w:rtl w:val="0"/>
+          <w:lang w:val="en-US"/>
+        </w:rPr>
+        <w:t xml:space="preserve">{%p endfor %}</w:t>
       </w:r>
     </w:p>
     <w:p>
@@ -36753,19 +36401,15 @@
         <w:spacing w:before="0" w:line="240" w:lineRule="auto"/>
         <w:rPr>
           <w:rFonts w:ascii="Arial" w:cs="Arial" w:hAnsi="Arial" w:eastAsia="Arial"/>
-          <w:sz w:val="22"/>
-          <w:szCs w:val="22"/>
         </w:rPr>
       </w:pPr>
       <w:r>
         <w:rPr>
           <w:rFonts w:ascii="Arial" w:hAnsi="Arial"/>
-          <w:sz w:val="22"/>
-          <w:szCs w:val="22"/>
           <w:rtl w:val="0"/>
           <w:lang w:val="en-US"/>
         </w:rPr>
-        <w:t>{% for line in ftr_findings_list %}</w:t>
+        <w:t xml:space="preserve">{%p for f in ftr_findings_items %}</w:t>
       </w:r>
     </w:p>
     <w:p>
@@ -36774,19 +36418,15 @@
         <w:spacing w:before="0" w:line="240" w:lineRule="auto"/>
         <w:rPr>
           <w:rFonts w:ascii="Arial" w:cs="Arial" w:hAnsi="Arial" w:eastAsia="Arial"/>
-          <w:sz w:val="22"/>
-          <w:szCs w:val="22"/>
         </w:rPr>
       </w:pPr>
       <w:r>
         <w:rPr>
           <w:rFonts w:ascii="Arial" w:hAnsi="Arial"/>
-          <w:sz w:val="22"/>
-          <w:szCs w:val="22"/>
           <w:rtl w:val="0"/>
           <w:lang w:val="en-US"/>
         </w:rPr>
-        <w:t>{{ line }}</w:t>
+        <w:t xml:space="preserve">{{ f.text }}</w:t>
       </w:r>
     </w:p>
     <w:p>
@@ -36795,19 +36435,67 @@
         <w:spacing w:before="0" w:line="240" w:lineRule="auto"/>
         <w:rPr>
           <w:rFonts w:ascii="Arial" w:cs="Arial" w:hAnsi="Arial" w:eastAsia="Arial"/>
-          <w:sz w:val="22"/>
-          <w:szCs w:val="22"/>
         </w:rPr>
       </w:pPr>
       <w:r>
         <w:rPr>
           <w:rFonts w:ascii="Arial" w:hAnsi="Arial"/>
-          <w:sz w:val="22"/>
-          <w:szCs w:val="22"/>
           <w:rtl w:val="0"/>
           <w:lang w:val="en-US"/>
         </w:rPr>
-        <w:t>{% endfor %}</w:t>
+        <w:t xml:space="preserve">{%p if f.photo %}</w:t>
+      </w:r>
+    </w:p>
+    <w:p>
+      <w:pPr>
+        <w:pStyle w:val="Default"/>
+        <w:spacing w:before="0" w:line="240" w:lineRule="auto"/>
+        <w:jc w:val="center"/>
+        <w:rPr>
+          <w:rFonts w:ascii="Arial" w:cs="Arial" w:hAnsi="Arial" w:eastAsia="Arial"/>
+        </w:rPr>
+      </w:pPr>
+      <w:r>
+        <w:rPr>
+          <w:rFonts w:ascii="Arial" w:hAnsi="Arial"/>
+          <w:rtl w:val="0"/>
+          <w:lang w:val="en-US"/>
+        </w:rPr>
+        <w:t xml:space="preserve">{{ f.photo }}</w:t>
+      </w:r>
+    </w:p>
+    <w:p>
+      <w:pPr>
+        <w:pStyle w:val="Default"/>
+        <w:spacing w:before="0" w:line="240" w:lineRule="auto"/>
+        <w:rPr>
+          <w:rFonts w:ascii="Arial" w:cs="Arial" w:hAnsi="Arial" w:eastAsia="Arial"/>
+        </w:rPr>
+      </w:pPr>
+      <w:r>
+        <w:rPr>
+          <w:rFonts w:ascii="Arial" w:hAnsi="Arial"/>
+          <w:rtl w:val="0"/>
+          <w:lang w:val="en-US"/>
+        </w:rPr>
+        <w:t xml:space="preserve">{%p endif %}</w:t>
+      </w:r>
+    </w:p>
+    <w:p>
+      <w:pPr>
+        <w:pStyle w:val="Default"/>
+        <w:spacing w:before="0" w:line="240" w:lineRule="auto"/>
+        <w:rPr>
+          <w:rFonts w:ascii="Arial" w:cs="Arial" w:hAnsi="Arial" w:eastAsia="Arial"/>
+        </w:rPr>
+      </w:pPr>
+      <w:r>
+        <w:rPr>
+          <w:rFonts w:ascii="Arial" w:hAnsi="Arial"/>
+          <w:rtl w:val="0"/>
+          <w:lang w:val="en-US"/>
+        </w:rPr>
+        <w:t xml:space="preserve">{%p endfor %}</w:t>
       </w:r>
     </w:p>
     <w:p>

</xml_diff>